<commit_message>
Align manual UI copy and figures with actual round-screen firmware
Replace stylized UI art with firmware-matched mockups, and document
each screen element (pairing, IR learn, AC, ambient light) as
implemented. Regenerate both PDF and Word manuals.

Co-authored-by: Davy <realDavy@users.noreply.github.com>
</commit_message>
<xml_diff>
--- a/docs/aidaegis_ac_remote_user_manual.docx
+++ b/docs/aidaegis_ac_remote_user_manual.docx
@@ -1080,7 +1080,7 @@
           <w:color w:val="23262A"/>
           <w:sz w:val="21"/>
         </w:rPr>
-        <w:t>设备根据使用阶段自动切换界面，主要页面如下：</w:t>
+        <w:t>设备按使用阶段自动切换以下四个界面（界面文案与布局以设备实际显示为准，下图为与产品一致的示意）：</w:t>
       </w:r>
     </w:p>
     <w:tbl>
@@ -1119,13 +1119,13 @@
                 <w:color w:val="FFFFFF"/>
                 <w:sz w:val="19"/>
               </w:rPr>
-              <w:t>界面</w:t>
+              <w:t>界面标题</w:t>
             </w:r>
           </w:p>
         </w:tc>
         <w:tc>
           <w:tcPr>
-            <w:tcW w:type="dxa" w:w="2835"/>
+            <w:tcW w:type="dxa" w:w="3118"/>
             <w:shd w:fill="183048" w:val="clear"/>
             <w:tcBorders>
               <w:top w:val="single" w:sz="4" w:color="D2D8DE"/>
@@ -1152,7 +1152,7 @@
         </w:tc>
         <w:tc>
           <w:tcPr>
-            <w:tcW w:type="dxa" w:w="4535"/>
+            <w:tcW w:type="dxa" w:w="4252"/>
             <w:shd w:fill="183048" w:val="clear"/>
             <w:tcBorders>
               <w:top w:val="single" w:sz="4" w:color="D2D8DE"/>
@@ -1173,7 +1173,7 @@
                 <w:color w:val="FFFFFF"/>
                 <w:sz w:val="19"/>
               </w:rPr>
-              <w:t>您可以做什么</w:t>
+              <w:t>主要操作</w:t>
             </w:r>
           </w:p>
         </w:tc>
@@ -1200,13 +1200,13 @@
                 <w:color w:val="23262A"/>
                 <w:sz w:val="19"/>
               </w:rPr>
-              <w:t>智能家居配网</w:t>
+              <w:t>Matter 配网</w:t>
             </w:r>
           </w:p>
         </w:tc>
         <w:tc>
           <w:tcPr>
-            <w:tcW w:type="dxa" w:w="2835"/>
+            <w:tcW w:type="dxa" w:w="3118"/>
             <w:tcBorders>
               <w:top w:val="single" w:sz="4" w:color="D2D8DE"/>
               <w:left w:val="single" w:sz="4" w:color="D2D8DE"/>
@@ -1225,13 +1225,13 @@
                 <w:color w:val="23262A"/>
                 <w:sz w:val="19"/>
               </w:rPr>
-              <w:t>首次上电或未完成配网时</w:t>
+              <w:t>首次上电或尚未完成智能家居配网</w:t>
             </w:r>
           </w:p>
         </w:tc>
         <w:tc>
           <w:tcPr>
-            <w:tcW w:type="dxa" w:w="4535"/>
+            <w:tcW w:type="dxa" w:w="4252"/>
             <w:tcBorders>
               <w:top w:val="single" w:sz="4" w:color="D2D8DE"/>
               <w:left w:val="single" w:sz="4" w:color="D2D8DE"/>
@@ -1250,7 +1250,7 @@
                 <w:color w:val="23262A"/>
                 <w:sz w:val="19"/>
               </w:rPr>
-              <w:t>扫码或输入配对码，加入家庭平台</w:t>
+              <w:t>扫码 / 输入配对码</w:t>
             </w:r>
           </w:p>
         </w:tc>
@@ -1284,7 +1284,7 @@
         </w:tc>
         <w:tc>
           <w:tcPr>
-            <w:tcW w:type="dxa" w:w="2835"/>
+            <w:tcW w:type="dxa" w:w="3118"/>
             <w:shd w:fill="F8FAFC" w:val="clear"/>
             <w:tcBorders>
               <w:top w:val="single" w:sz="4" w:color="D2D8DE"/>
@@ -1304,13 +1304,13 @@
                 <w:color w:val="23262A"/>
                 <w:sz w:val="19"/>
               </w:rPr>
-              <w:t>配网完成后尚未绑定空调时</w:t>
+              <w:t>已配网但尚未绑定空调</w:t>
             </w:r>
           </w:p>
         </w:tc>
         <w:tc>
           <w:tcPr>
-            <w:tcW w:type="dxa" w:w="4535"/>
+            <w:tcW w:type="dxa" w:w="4252"/>
             <w:shd w:fill="F8FAFC" w:val="clear"/>
             <w:tcBorders>
               <w:top w:val="single" w:sz="4" w:color="D2D8DE"/>
@@ -1330,7 +1330,7 @@
                 <w:color w:val="23262A"/>
                 <w:sz w:val="19"/>
               </w:rPr>
-              <w:t>点按「开始学习」，用原装遥控绑定</w:t>
+              <w:t>点按「开始学习」并用原装遥控学码</w:t>
             </w:r>
           </w:p>
         </w:tc>
@@ -1357,13 +1357,13 @@
                 <w:color w:val="23262A"/>
                 <w:sz w:val="19"/>
               </w:rPr>
-              <w:t>空调控制</w:t>
+              <w:t>空调</w:t>
             </w:r>
           </w:p>
         </w:tc>
         <w:tc>
           <w:tcPr>
-            <w:tcW w:type="dxa" w:w="2835"/>
+            <w:tcW w:type="dxa" w:w="3118"/>
             <w:tcBorders>
               <w:top w:val="single" w:sz="4" w:color="D2D8DE"/>
               <w:left w:val="single" w:sz="4" w:color="D2D8DE"/>
@@ -1388,7 +1388,7 @@
         </w:tc>
         <w:tc>
           <w:tcPr>
-            <w:tcW w:type="dxa" w:w="4535"/>
+            <w:tcW w:type="dxa" w:w="4252"/>
             <w:tcBorders>
               <w:top w:val="single" w:sz="4" w:color="D2D8DE"/>
               <w:left w:val="single" w:sz="4" w:color="D2D8DE"/>
@@ -1407,7 +1407,7 @@
                 <w:color w:val="23262A"/>
                 <w:sz w:val="19"/>
               </w:rPr>
-              <w:t>开关空调、调节温度；左滑进入灯光</w:t>
+              <w:t>开启/关闭、降温/升温；左滑进入灯光</w:t>
             </w:r>
           </w:p>
         </w:tc>
@@ -1441,7 +1441,7 @@
         </w:tc>
         <w:tc>
           <w:tcPr>
-            <w:tcW w:type="dxa" w:w="2835"/>
+            <w:tcW w:type="dxa" w:w="3118"/>
             <w:shd w:fill="F8FAFC" w:val="clear"/>
             <w:tcBorders>
               <w:top w:val="single" w:sz="4" w:color="D2D8DE"/>
@@ -1467,7 +1467,7 @@
         </w:tc>
         <w:tc>
           <w:tcPr>
-            <w:tcW w:type="dxa" w:w="4535"/>
+            <w:tcW w:type="dxa" w:w="4252"/>
             <w:shd w:fill="F8FAFC" w:val="clear"/>
             <w:tcBorders>
               <w:top w:val="single" w:sz="4" w:color="D2D8DE"/>
@@ -1487,7 +1487,7 @@
                 <w:color w:val="23262A"/>
                 <w:sz w:val="19"/>
               </w:rPr>
-              <w:t>选择灯光模式、调节亮度</w:t>
+              <w:t>选择灯光模式、拖动亮度滑条；右滑返回</w:t>
             </w:r>
           </w:p>
         </w:tc>
@@ -1629,7 +1629,7 @@
                 <w:color w:val="6E747C"/>
                 <w:sz w:val="17"/>
               </w:rPr>
-              <w:t>图 2-3  配网页</w:t>
+              <w:t>图 2-3  Matter 配网页</w:t>
             </w:r>
           </w:p>
         </w:tc>
@@ -1824,6 +1824,45 @@
                 <w:sz w:val="17"/>
               </w:rPr>
               <w:t>图 2-6  氛围灯光页</w:t>
+            </w:r>
+          </w:p>
+        </w:tc>
+      </w:tr>
+    </w:tbl>
+    <w:p/>
+    <w:tbl>
+      <w:tblPr>
+        <w:tblW w:type="auto" w:w="0"/>
+        <w:jc w:val="center"/>
+        <w:tblLook w:firstColumn="1" w:firstRow="1" w:lastColumn="0" w:lastRow="0" w:noHBand="0" w:noVBand="1" w:val="04A0"/>
+      </w:tblPr>
+      <w:tblGrid>
+        <w:gridCol w:w="9638"/>
+      </w:tblGrid>
+      <w:tr>
+        <w:tc>
+          <w:tcPr>
+            <w:tcW w:type="dxa" w:w="9638"/>
+            <w:shd w:fill="F5F8FC" w:val="clear"/>
+            <w:tcBorders>
+              <w:top w:val="single" w:sz="4" w:color="B4C8DC"/>
+              <w:left w:val="single" w:sz="4" w:color="B4C8DC"/>
+              <w:bottom w:val="single" w:sz="4" w:color="B4C8DC"/>
+              <w:right w:val="single" w:sz="4" w:color="B4C8DC"/>
+            </w:tcBorders>
+          </w:tcPr>
+          <w:p>
+            <w:pPr>
+              <w:spacing w:before="80" w:after="80" w:lineRule="auto" w:line="300"/>
+            </w:pPr>
+            <w:r>
+              <w:rPr>
+                <w:rFonts w:ascii="Microsoft YaHei" w:hAnsi="Microsoft YaHei" w:eastAsia="Microsoft YaHei" w:cs="Microsoft YaHei"/>
+                <w:b w:val="0"/>
+                <w:color w:val="23262A"/>
+                <w:sz w:val="19"/>
+              </w:rPr>
+              <w:t>提示：各页右上角均有「EN」按钮，可切换中文 / 英文界面（英文界面显示为「中文」）。出厂默认中文。</w:t>
             </w:r>
           </w:p>
         </w:tc>
@@ -2052,7 +2091,7 @@
           <w:color w:val="23262A"/>
           <w:sz w:val="21"/>
         </w:rPr>
-        <w:t>首次上电后，圆屏将显示「Matter 配网」界面，包含动态二维码与数字配对码。请使用您常用的智能家居 App 完成添加。</w:t>
+        <w:t>首次上电或尚未完成配网时，圆屏显示「Matter 配网」页。请使用您常用的智能家居 App 完成添加。</w:t>
       </w:r>
     </w:p>
     <w:p>
@@ -2107,9 +2146,356 @@
           <w:color w:val="6E747C"/>
           <w:sz w:val="18"/>
         </w:rPr>
-        <w:t>图 4-1  配网界面：扫码或输入配对码</w:t>
+        <w:t>图 4-1  Matter 配网页（示意；请以屏上实时内容为准）</w:t>
       </w:r>
     </w:p>
+    <w:p>
+      <w:pPr>
+        <w:spacing w:before="240" w:after="120" w:lineRule="auto" w:line="300"/>
+      </w:pPr>
+      <w:r>
+        <w:rPr>
+          <w:rFonts w:ascii="Microsoft YaHei" w:hAnsi="Microsoft YaHei" w:eastAsia="Microsoft YaHei" w:cs="Microsoft YaHei"/>
+          <w:b/>
+          <w:color w:val="244060"/>
+          <w:sz w:val="25"/>
+        </w:rPr>
+        <w:t>界面说明</w:t>
+      </w:r>
+    </w:p>
+    <w:tbl>
+      <w:tblPr>
+        <w:tblW w:type="auto" w:w="0"/>
+        <w:jc w:val="center"/>
+        <w:tblLayout w:type="autofit"/>
+        <w:tblLook w:firstColumn="1" w:firstRow="1" w:lastColumn="0" w:lastRow="0" w:noHBand="0" w:noVBand="1" w:val="04A0"/>
+      </w:tblPr>
+      <w:tblGrid>
+        <w:gridCol w:w="4819"/>
+        <w:gridCol w:w="4819"/>
+      </w:tblGrid>
+      <w:tr>
+        <w:tc>
+          <w:tcPr>
+            <w:tcW w:type="dxa" w:w="2835"/>
+            <w:shd w:fill="183048" w:val="clear"/>
+            <w:tcBorders>
+              <w:top w:val="single" w:sz="4" w:color="D2D8DE"/>
+              <w:left w:val="single" w:sz="4" w:color="D2D8DE"/>
+              <w:bottom w:val="single" w:sz="4" w:color="D2D8DE"/>
+              <w:right w:val="single" w:sz="4" w:color="D2D8DE"/>
+            </w:tcBorders>
+          </w:tcPr>
+          <w:p>
+            <w:pPr>
+              <w:spacing w:before="60" w:after="60" w:lineRule="auto" w:line="300"/>
+              <w:jc w:val="center"/>
+            </w:pPr>
+            <w:r>
+              <w:rPr>
+                <w:rFonts w:ascii="Microsoft YaHei" w:hAnsi="Microsoft YaHei" w:eastAsia="Microsoft YaHei" w:cs="Microsoft YaHei"/>
+                <w:b/>
+                <w:color w:val="FFFFFF"/>
+                <w:sz w:val="19"/>
+              </w:rPr>
+              <w:t>屏幕元素</w:t>
+            </w:r>
+          </w:p>
+        </w:tc>
+        <w:tc>
+          <w:tcPr>
+            <w:tcW w:type="dxa" w:w="6520"/>
+            <w:shd w:fill="183048" w:val="clear"/>
+            <w:tcBorders>
+              <w:top w:val="single" w:sz="4" w:color="D2D8DE"/>
+              <w:left w:val="single" w:sz="4" w:color="D2D8DE"/>
+              <w:bottom w:val="single" w:sz="4" w:color="D2D8DE"/>
+              <w:right w:val="single" w:sz="4" w:color="D2D8DE"/>
+            </w:tcBorders>
+          </w:tcPr>
+          <w:p>
+            <w:pPr>
+              <w:spacing w:before="60" w:after="60" w:lineRule="auto" w:line="300"/>
+              <w:jc w:val="center"/>
+            </w:pPr>
+            <w:r>
+              <w:rPr>
+                <w:rFonts w:ascii="Microsoft YaHei" w:hAnsi="Microsoft YaHei" w:eastAsia="Microsoft YaHei" w:cs="Microsoft YaHei"/>
+                <w:b/>
+                <w:color w:val="FFFFFF"/>
+                <w:sz w:val="19"/>
+              </w:rPr>
+              <w:t>功能说明</w:t>
+            </w:r>
+          </w:p>
+        </w:tc>
+      </w:tr>
+      <w:tr>
+        <w:tc>
+          <w:tcPr>
+            <w:tcW w:type="dxa" w:w="2835"/>
+            <w:tcBorders>
+              <w:top w:val="single" w:sz="4" w:color="D2D8DE"/>
+              <w:left w:val="single" w:sz="4" w:color="D2D8DE"/>
+              <w:bottom w:val="single" w:sz="4" w:color="D2D8DE"/>
+              <w:right w:val="single" w:sz="4" w:color="D2D8DE"/>
+            </w:tcBorders>
+          </w:tcPr>
+          <w:p>
+            <w:pPr>
+              <w:spacing w:before="40" w:after="40" w:lineRule="auto" w:line="300"/>
+            </w:pPr>
+            <w:r>
+              <w:rPr>
+                <w:rFonts w:ascii="Microsoft YaHei" w:hAnsi="Microsoft YaHei" w:eastAsia="Microsoft YaHei" w:cs="Microsoft YaHei"/>
+                <w:b w:val="0"/>
+                <w:color w:val="23262A"/>
+                <w:sz w:val="19"/>
+              </w:rPr>
+              <w:t>标题「Matter 配网」</w:t>
+            </w:r>
+          </w:p>
+        </w:tc>
+        <w:tc>
+          <w:tcPr>
+            <w:tcW w:type="dxa" w:w="6520"/>
+            <w:tcBorders>
+              <w:top w:val="single" w:sz="4" w:color="D2D8DE"/>
+              <w:left w:val="single" w:sz="4" w:color="D2D8DE"/>
+              <w:bottom w:val="single" w:sz="4" w:color="D2D8DE"/>
+              <w:right w:val="single" w:sz="4" w:color="D2D8DE"/>
+            </w:tcBorders>
+          </w:tcPr>
+          <w:p>
+            <w:pPr>
+              <w:spacing w:before="40" w:after="40" w:lineRule="auto" w:line="300"/>
+            </w:pPr>
+            <w:r>
+              <w:rPr>
+                <w:rFonts w:ascii="Microsoft YaHei" w:hAnsi="Microsoft YaHei" w:eastAsia="Microsoft YaHei" w:cs="Microsoft YaHei"/>
+                <w:b w:val="0"/>
+                <w:color w:val="23262A"/>
+                <w:sz w:val="19"/>
+              </w:rPr>
+              <w:t>当前处于智能家居配网阶段</w:t>
+            </w:r>
+          </w:p>
+        </w:tc>
+      </w:tr>
+      <w:tr>
+        <w:tc>
+          <w:tcPr>
+            <w:tcW w:type="dxa" w:w="2835"/>
+            <w:shd w:fill="F8FAFC" w:val="clear"/>
+            <w:tcBorders>
+              <w:top w:val="single" w:sz="4" w:color="D2D8DE"/>
+              <w:left w:val="single" w:sz="4" w:color="D2D8DE"/>
+              <w:bottom w:val="single" w:sz="4" w:color="D2D8DE"/>
+              <w:right w:val="single" w:sz="4" w:color="D2D8DE"/>
+            </w:tcBorders>
+          </w:tcPr>
+          <w:p>
+            <w:pPr>
+              <w:spacing w:before="40" w:after="40" w:lineRule="auto" w:line="300"/>
+            </w:pPr>
+            <w:r>
+              <w:rPr>
+                <w:rFonts w:ascii="Microsoft YaHei" w:hAnsi="Microsoft YaHei" w:eastAsia="Microsoft YaHei" w:cs="Microsoft YaHei"/>
+                <w:b w:val="0"/>
+                <w:color w:val="23262A"/>
+                <w:sz w:val="19"/>
+              </w:rPr>
+              <w:t>提示「请扫码或输入配对码」</w:t>
+            </w:r>
+          </w:p>
+        </w:tc>
+        <w:tc>
+          <w:tcPr>
+            <w:tcW w:type="dxa" w:w="6520"/>
+            <w:shd w:fill="F8FAFC" w:val="clear"/>
+            <w:tcBorders>
+              <w:top w:val="single" w:sz="4" w:color="D2D8DE"/>
+              <w:left w:val="single" w:sz="4" w:color="D2D8DE"/>
+              <w:bottom w:val="single" w:sz="4" w:color="D2D8DE"/>
+              <w:right w:val="single" w:sz="4" w:color="D2D8DE"/>
+            </w:tcBorders>
+          </w:tcPr>
+          <w:p>
+            <w:pPr>
+              <w:spacing w:before="40" w:after="40" w:lineRule="auto" w:line="300"/>
+            </w:pPr>
+            <w:r>
+              <w:rPr>
+                <w:rFonts w:ascii="Microsoft YaHei" w:hAnsi="Microsoft YaHei" w:eastAsia="Microsoft YaHei" w:cs="Microsoft YaHei"/>
+                <w:b w:val="0"/>
+                <w:color w:val="23262A"/>
+                <w:sz w:val="19"/>
+              </w:rPr>
+              <w:t>引导使用 App 扫码或手输配对码</w:t>
+            </w:r>
+          </w:p>
+        </w:tc>
+      </w:tr>
+      <w:tr>
+        <w:tc>
+          <w:tcPr>
+            <w:tcW w:type="dxa" w:w="2835"/>
+            <w:tcBorders>
+              <w:top w:val="single" w:sz="4" w:color="D2D8DE"/>
+              <w:left w:val="single" w:sz="4" w:color="D2D8DE"/>
+              <w:bottom w:val="single" w:sz="4" w:color="D2D8DE"/>
+              <w:right w:val="single" w:sz="4" w:color="D2D8DE"/>
+            </w:tcBorders>
+          </w:tcPr>
+          <w:p>
+            <w:pPr>
+              <w:spacing w:before="40" w:after="40" w:lineRule="auto" w:line="300"/>
+            </w:pPr>
+            <w:r>
+              <w:rPr>
+                <w:rFonts w:ascii="Microsoft YaHei" w:hAnsi="Microsoft YaHei" w:eastAsia="Microsoft YaHei" w:cs="Microsoft YaHei"/>
+                <w:b w:val="0"/>
+                <w:color w:val="23262A"/>
+                <w:sz w:val="19"/>
+              </w:rPr>
+              <w:t>中央二维码</w:t>
+            </w:r>
+          </w:p>
+        </w:tc>
+        <w:tc>
+          <w:tcPr>
+            <w:tcW w:type="dxa" w:w="6520"/>
+            <w:tcBorders>
+              <w:top w:val="single" w:sz="4" w:color="D2D8DE"/>
+              <w:left w:val="single" w:sz="4" w:color="D2D8DE"/>
+              <w:bottom w:val="single" w:sz="4" w:color="D2D8DE"/>
+              <w:right w:val="single" w:sz="4" w:color="D2D8DE"/>
+            </w:tcBorders>
+          </w:tcPr>
+          <w:p>
+            <w:pPr>
+              <w:spacing w:before="40" w:after="40" w:lineRule="auto" w:line="300"/>
+            </w:pPr>
+            <w:r>
+              <w:rPr>
+                <w:rFonts w:ascii="Microsoft YaHei" w:hAnsi="Microsoft YaHei" w:eastAsia="Microsoft YaHei" w:cs="Microsoft YaHei"/>
+                <w:b w:val="0"/>
+                <w:color w:val="23262A"/>
+                <w:sz w:val="19"/>
+              </w:rPr>
+              <w:t>由设备实时生成的 Matter 配网码，供 App 扫描</w:t>
+            </w:r>
+          </w:p>
+        </w:tc>
+      </w:tr>
+      <w:tr>
+        <w:tc>
+          <w:tcPr>
+            <w:tcW w:type="dxa" w:w="2835"/>
+            <w:shd w:fill="F8FAFC" w:val="clear"/>
+            <w:tcBorders>
+              <w:top w:val="single" w:sz="4" w:color="D2D8DE"/>
+              <w:left w:val="single" w:sz="4" w:color="D2D8DE"/>
+              <w:bottom w:val="single" w:sz="4" w:color="D2D8DE"/>
+              <w:right w:val="single" w:sz="4" w:color="D2D8DE"/>
+            </w:tcBorders>
+          </w:tcPr>
+          <w:p>
+            <w:pPr>
+              <w:spacing w:before="40" w:after="40" w:lineRule="auto" w:line="300"/>
+            </w:pPr>
+            <w:r>
+              <w:rPr>
+                <w:rFonts w:ascii="Microsoft YaHei" w:hAnsi="Microsoft YaHei" w:eastAsia="Microsoft YaHei" w:cs="Microsoft YaHei"/>
+                <w:b w:val="0"/>
+                <w:color w:val="23262A"/>
+                <w:sz w:val="19"/>
+              </w:rPr>
+              <w:t>「配对码」+ 数字</w:t>
+            </w:r>
+          </w:p>
+        </w:tc>
+        <w:tc>
+          <w:tcPr>
+            <w:tcW w:type="dxa" w:w="6520"/>
+            <w:shd w:fill="F8FAFC" w:val="clear"/>
+            <w:tcBorders>
+              <w:top w:val="single" w:sz="4" w:color="D2D8DE"/>
+              <w:left w:val="single" w:sz="4" w:color="D2D8DE"/>
+              <w:bottom w:val="single" w:sz="4" w:color="D2D8DE"/>
+              <w:right w:val="single" w:sz="4" w:color="D2D8DE"/>
+            </w:tcBorders>
+          </w:tcPr>
+          <w:p>
+            <w:pPr>
+              <w:spacing w:before="40" w:after="40" w:lineRule="auto" w:line="300"/>
+            </w:pPr>
+            <w:r>
+              <w:rPr>
+                <w:rFonts w:ascii="Microsoft YaHei" w:hAnsi="Microsoft YaHei" w:eastAsia="Microsoft YaHei" w:cs="Microsoft YaHei"/>
+                <w:b w:val="0"/>
+                <w:color w:val="23262A"/>
+                <w:sz w:val="19"/>
+              </w:rPr>
+              <w:t>无法扫码时，在 App 中手动输入该数字码</w:t>
+            </w:r>
+          </w:p>
+        </w:tc>
+      </w:tr>
+      <w:tr>
+        <w:tc>
+          <w:tcPr>
+            <w:tcW w:type="dxa" w:w="2835"/>
+            <w:tcBorders>
+              <w:top w:val="single" w:sz="4" w:color="D2D8DE"/>
+              <w:left w:val="single" w:sz="4" w:color="D2D8DE"/>
+              <w:bottom w:val="single" w:sz="4" w:color="D2D8DE"/>
+              <w:right w:val="single" w:sz="4" w:color="D2D8DE"/>
+            </w:tcBorders>
+          </w:tcPr>
+          <w:p>
+            <w:pPr>
+              <w:spacing w:before="40" w:after="40" w:lineRule="auto" w:line="300"/>
+            </w:pPr>
+            <w:r>
+              <w:rPr>
+                <w:rFonts w:ascii="Microsoft YaHei" w:hAnsi="Microsoft YaHei" w:eastAsia="Microsoft YaHei" w:cs="Microsoft YaHei"/>
+                <w:b w:val="0"/>
+                <w:color w:val="23262A"/>
+                <w:sz w:val="19"/>
+              </w:rPr>
+              <w:t>右上角「EN」</w:t>
+            </w:r>
+          </w:p>
+        </w:tc>
+        <w:tc>
+          <w:tcPr>
+            <w:tcW w:type="dxa" w:w="6520"/>
+            <w:tcBorders>
+              <w:top w:val="single" w:sz="4" w:color="D2D8DE"/>
+              <w:left w:val="single" w:sz="4" w:color="D2D8DE"/>
+              <w:bottom w:val="single" w:sz="4" w:color="D2D8DE"/>
+              <w:right w:val="single" w:sz="4" w:color="D2D8DE"/>
+            </w:tcBorders>
+          </w:tcPr>
+          <w:p>
+            <w:pPr>
+              <w:spacing w:before="40" w:after="40" w:lineRule="auto" w:line="300"/>
+            </w:pPr>
+            <w:r>
+              <w:rPr>
+                <w:rFonts w:ascii="Microsoft YaHei" w:hAnsi="Microsoft YaHei" w:eastAsia="Microsoft YaHei" w:cs="Microsoft YaHei"/>
+                <w:b w:val="0"/>
+                <w:color w:val="23262A"/>
+                <w:sz w:val="19"/>
+              </w:rPr>
+              <w:t>切换为英文界面</w:t>
+            </w:r>
+          </w:p>
+        </w:tc>
+      </w:tr>
+    </w:tbl>
+    <w:p/>
     <w:p>
       <w:pPr>
         <w:spacing w:before="240" w:after="120" w:lineRule="auto" w:line="300"/>
@@ -2181,7 +2567,7 @@
           <w:color w:val="23262A"/>
           <w:sz w:val="21"/>
         </w:rPr>
-        <w:t>扫描屏上二维码；若不便扫码，可手动输入屏上显示的数字配对码。</w:t>
+        <w:t>扫描屏上二维码；若不便扫码，可手动输入屏上「配对码」下方的数字。</w:t>
       </w:r>
     </w:p>
     <w:p>
@@ -2246,7 +2632,7 @@
                 <w:color w:val="23262A"/>
                 <w:sz w:val="19"/>
               </w:rPr>
-              <w:t>提示：屏上二维码由设备实时生成。请务必扫描当前屏幕显示的二维码，勿使用说明书或其他渠道中的示例图片。</w:t>
+              <w:t>提示：屏上二维码与配对码由设备实时生成。请务必使用当前屏幕显示的内容，勿扫描说明书中的示例图。</w:t>
             </w:r>
           </w:p>
         </w:tc>
@@ -2278,7 +2664,7 @@
           <w:color w:val="23262A"/>
           <w:sz w:val="21"/>
         </w:rPr>
-        <w:t>完成智能家居配网后，若尚未绑定空调，屏幕将进入「红外学习」页。请准备好空调原装遥控器。</w:t>
+        <w:t>完成智能家居配网后，若尚未绑定空调，屏幕进入「红外学习」页。请准备好空调原装遥控器。</w:t>
       </w:r>
     </w:p>
     <w:p>
@@ -2333,9 +2719,304 @@
           <w:color w:val="6E747C"/>
           <w:sz w:val="18"/>
         </w:rPr>
-        <w:t>图 5-1  红外学习界面</w:t>
+        <w:t>图 5-1  红外学习页</w:t>
       </w:r>
     </w:p>
+    <w:p>
+      <w:pPr>
+        <w:spacing w:before="240" w:after="120" w:lineRule="auto" w:line="300"/>
+      </w:pPr>
+      <w:r>
+        <w:rPr>
+          <w:rFonts w:ascii="Microsoft YaHei" w:hAnsi="Microsoft YaHei" w:eastAsia="Microsoft YaHei" w:cs="Microsoft YaHei"/>
+          <w:b/>
+          <w:color w:val="244060"/>
+          <w:sz w:val="25"/>
+        </w:rPr>
+        <w:t>界面说明</w:t>
+      </w:r>
+    </w:p>
+    <w:tbl>
+      <w:tblPr>
+        <w:tblW w:type="auto" w:w="0"/>
+        <w:jc w:val="center"/>
+        <w:tblLayout w:type="autofit"/>
+        <w:tblLook w:firstColumn="1" w:firstRow="1" w:lastColumn="0" w:lastRow="0" w:noHBand="0" w:noVBand="1" w:val="04A0"/>
+      </w:tblPr>
+      <w:tblGrid>
+        <w:gridCol w:w="4819"/>
+        <w:gridCol w:w="4819"/>
+      </w:tblGrid>
+      <w:tr>
+        <w:tc>
+          <w:tcPr>
+            <w:tcW w:type="dxa" w:w="2835"/>
+            <w:shd w:fill="183048" w:val="clear"/>
+            <w:tcBorders>
+              <w:top w:val="single" w:sz="4" w:color="D2D8DE"/>
+              <w:left w:val="single" w:sz="4" w:color="D2D8DE"/>
+              <w:bottom w:val="single" w:sz="4" w:color="D2D8DE"/>
+              <w:right w:val="single" w:sz="4" w:color="D2D8DE"/>
+            </w:tcBorders>
+          </w:tcPr>
+          <w:p>
+            <w:pPr>
+              <w:spacing w:before="60" w:after="60" w:lineRule="auto" w:line="300"/>
+              <w:jc w:val="center"/>
+            </w:pPr>
+            <w:r>
+              <w:rPr>
+                <w:rFonts w:ascii="Microsoft YaHei" w:hAnsi="Microsoft YaHei" w:eastAsia="Microsoft YaHei" w:cs="Microsoft YaHei"/>
+                <w:b/>
+                <w:color w:val="FFFFFF"/>
+                <w:sz w:val="19"/>
+              </w:rPr>
+              <w:t>屏幕元素</w:t>
+            </w:r>
+          </w:p>
+        </w:tc>
+        <w:tc>
+          <w:tcPr>
+            <w:tcW w:type="dxa" w:w="6520"/>
+            <w:shd w:fill="183048" w:val="clear"/>
+            <w:tcBorders>
+              <w:top w:val="single" w:sz="4" w:color="D2D8DE"/>
+              <w:left w:val="single" w:sz="4" w:color="D2D8DE"/>
+              <w:bottom w:val="single" w:sz="4" w:color="D2D8DE"/>
+              <w:right w:val="single" w:sz="4" w:color="D2D8DE"/>
+            </w:tcBorders>
+          </w:tcPr>
+          <w:p>
+            <w:pPr>
+              <w:spacing w:before="60" w:after="60" w:lineRule="auto" w:line="300"/>
+              <w:jc w:val="center"/>
+            </w:pPr>
+            <w:r>
+              <w:rPr>
+                <w:rFonts w:ascii="Microsoft YaHei" w:hAnsi="Microsoft YaHei" w:eastAsia="Microsoft YaHei" w:cs="Microsoft YaHei"/>
+                <w:b/>
+                <w:color w:val="FFFFFF"/>
+                <w:sz w:val="19"/>
+              </w:rPr>
+              <w:t>功能说明</w:t>
+            </w:r>
+          </w:p>
+        </w:tc>
+      </w:tr>
+      <w:tr>
+        <w:tc>
+          <w:tcPr>
+            <w:tcW w:type="dxa" w:w="2835"/>
+            <w:tcBorders>
+              <w:top w:val="single" w:sz="4" w:color="D2D8DE"/>
+              <w:left w:val="single" w:sz="4" w:color="D2D8DE"/>
+              <w:bottom w:val="single" w:sz="4" w:color="D2D8DE"/>
+              <w:right w:val="single" w:sz="4" w:color="D2D8DE"/>
+            </w:tcBorders>
+          </w:tcPr>
+          <w:p>
+            <w:pPr>
+              <w:spacing w:before="40" w:after="40" w:lineRule="auto" w:line="300"/>
+            </w:pPr>
+            <w:r>
+              <w:rPr>
+                <w:rFonts w:ascii="Microsoft YaHei" w:hAnsi="Microsoft YaHei" w:eastAsia="Microsoft YaHei" w:cs="Microsoft YaHei"/>
+                <w:b w:val="0"/>
+                <w:color w:val="23262A"/>
+                <w:sz w:val="19"/>
+              </w:rPr>
+              <w:t>标题「红外学习」</w:t>
+            </w:r>
+          </w:p>
+        </w:tc>
+        <w:tc>
+          <w:tcPr>
+            <w:tcW w:type="dxa" w:w="6520"/>
+            <w:tcBorders>
+              <w:top w:val="single" w:sz="4" w:color="D2D8DE"/>
+              <w:left w:val="single" w:sz="4" w:color="D2D8DE"/>
+              <w:bottom w:val="single" w:sz="4" w:color="D2D8DE"/>
+              <w:right w:val="single" w:sz="4" w:color="D2D8DE"/>
+            </w:tcBorders>
+          </w:tcPr>
+          <w:p>
+            <w:pPr>
+              <w:spacing w:before="40" w:after="40" w:lineRule="auto" w:line="300"/>
+            </w:pPr>
+            <w:r>
+              <w:rPr>
+                <w:rFonts w:ascii="Microsoft YaHei" w:hAnsi="Microsoft YaHei" w:eastAsia="Microsoft YaHei" w:cs="Microsoft YaHei"/>
+                <w:b w:val="0"/>
+                <w:color w:val="23262A"/>
+                <w:sz w:val="19"/>
+              </w:rPr>
+              <w:t>当前处于空调绑定阶段</w:t>
+            </w:r>
+          </w:p>
+        </w:tc>
+      </w:tr>
+      <w:tr>
+        <w:tc>
+          <w:tcPr>
+            <w:tcW w:type="dxa" w:w="2835"/>
+            <w:shd w:fill="F8FAFC" w:val="clear"/>
+            <w:tcBorders>
+              <w:top w:val="single" w:sz="4" w:color="D2D8DE"/>
+              <w:left w:val="single" w:sz="4" w:color="D2D8DE"/>
+              <w:bottom w:val="single" w:sz="4" w:color="D2D8DE"/>
+              <w:right w:val="single" w:sz="4" w:color="D2D8DE"/>
+            </w:tcBorders>
+          </w:tcPr>
+          <w:p>
+            <w:pPr>
+              <w:spacing w:before="40" w:after="40" w:lineRule="auto" w:line="300"/>
+            </w:pPr>
+            <w:r>
+              <w:rPr>
+                <w:rFonts w:ascii="Microsoft YaHei" w:hAnsi="Microsoft YaHei" w:eastAsia="Microsoft YaHei" w:cs="Microsoft YaHei"/>
+                <w:b w:val="0"/>
+                <w:color w:val="23262A"/>
+                <w:sz w:val="19"/>
+              </w:rPr>
+              <w:t>提示「对准遥控按任意键」</w:t>
+            </w:r>
+          </w:p>
+        </w:tc>
+        <w:tc>
+          <w:tcPr>
+            <w:tcW w:type="dxa" w:w="6520"/>
+            <w:shd w:fill="F8FAFC" w:val="clear"/>
+            <w:tcBorders>
+              <w:top w:val="single" w:sz="4" w:color="D2D8DE"/>
+              <w:left w:val="single" w:sz="4" w:color="D2D8DE"/>
+              <w:bottom w:val="single" w:sz="4" w:color="D2D8DE"/>
+              <w:right w:val="single" w:sz="4" w:color="D2D8DE"/>
+            </w:tcBorders>
+          </w:tcPr>
+          <w:p>
+            <w:pPr>
+              <w:spacing w:before="40" w:after="40" w:lineRule="auto" w:line="300"/>
+            </w:pPr>
+            <w:r>
+              <w:rPr>
+                <w:rFonts w:ascii="Microsoft YaHei" w:hAnsi="Microsoft YaHei" w:eastAsia="Microsoft YaHei" w:cs="Microsoft YaHei"/>
+                <w:b w:val="0"/>
+                <w:color w:val="23262A"/>
+                <w:sz w:val="19"/>
+              </w:rPr>
+              <w:t>学习开始后，请用原装遥控对准本机按键</w:t>
+            </w:r>
+          </w:p>
+        </w:tc>
+      </w:tr>
+      <w:tr>
+        <w:tc>
+          <w:tcPr>
+            <w:tcW w:type="dxa" w:w="2835"/>
+            <w:tcBorders>
+              <w:top w:val="single" w:sz="4" w:color="D2D8DE"/>
+              <w:left w:val="single" w:sz="4" w:color="D2D8DE"/>
+              <w:bottom w:val="single" w:sz="4" w:color="D2D8DE"/>
+              <w:right w:val="single" w:sz="4" w:color="D2D8DE"/>
+            </w:tcBorders>
+          </w:tcPr>
+          <w:p>
+            <w:pPr>
+              <w:spacing w:before="40" w:after="40" w:lineRule="auto" w:line="300"/>
+            </w:pPr>
+            <w:r>
+              <w:rPr>
+                <w:rFonts w:ascii="Microsoft YaHei" w:hAnsi="Microsoft YaHei" w:eastAsia="Microsoft YaHei" w:cs="Microsoft YaHei"/>
+                <w:b w:val="0"/>
+                <w:color w:val="23262A"/>
+                <w:sz w:val="19"/>
+              </w:rPr>
+              <w:t>「开始学习」按钮</w:t>
+            </w:r>
+          </w:p>
+        </w:tc>
+        <w:tc>
+          <w:tcPr>
+            <w:tcW w:type="dxa" w:w="6520"/>
+            <w:tcBorders>
+              <w:top w:val="single" w:sz="4" w:color="D2D8DE"/>
+              <w:left w:val="single" w:sz="4" w:color="D2D8DE"/>
+              <w:bottom w:val="single" w:sz="4" w:color="D2D8DE"/>
+              <w:right w:val="single" w:sz="4" w:color="D2D8DE"/>
+            </w:tcBorders>
+          </w:tcPr>
+          <w:p>
+            <w:pPr>
+              <w:spacing w:before="40" w:after="40" w:lineRule="auto" w:line="300"/>
+            </w:pPr>
+            <w:r>
+              <w:rPr>
+                <w:rFonts w:ascii="Microsoft YaHei" w:hAnsi="Microsoft YaHei" w:eastAsia="Microsoft YaHei" w:cs="Microsoft YaHei"/>
+                <w:b w:val="0"/>
+                <w:color w:val="23262A"/>
+                <w:sz w:val="19"/>
+              </w:rPr>
+              <w:t>点按后开始等待红外信号；等待中按钮显示为「...」</w:t>
+            </w:r>
+          </w:p>
+        </w:tc>
+      </w:tr>
+      <w:tr>
+        <w:tc>
+          <w:tcPr>
+            <w:tcW w:type="dxa" w:w="2835"/>
+            <w:shd w:fill="F8FAFC" w:val="clear"/>
+            <w:tcBorders>
+              <w:top w:val="single" w:sz="4" w:color="D2D8DE"/>
+              <w:left w:val="single" w:sz="4" w:color="D2D8DE"/>
+              <w:bottom w:val="single" w:sz="4" w:color="D2D8DE"/>
+              <w:right w:val="single" w:sz="4" w:color="D2D8DE"/>
+            </w:tcBorders>
+          </w:tcPr>
+          <w:p>
+            <w:pPr>
+              <w:spacing w:before="40" w:after="40" w:lineRule="auto" w:line="300"/>
+            </w:pPr>
+            <w:r>
+              <w:rPr>
+                <w:rFonts w:ascii="Microsoft YaHei" w:hAnsi="Microsoft YaHei" w:eastAsia="Microsoft YaHei" w:cs="Microsoft YaHei"/>
+                <w:b w:val="0"/>
+                <w:color w:val="23262A"/>
+                <w:sz w:val="19"/>
+              </w:rPr>
+              <w:t>右上角「EN」</w:t>
+            </w:r>
+          </w:p>
+        </w:tc>
+        <w:tc>
+          <w:tcPr>
+            <w:tcW w:type="dxa" w:w="6520"/>
+            <w:shd w:fill="F8FAFC" w:val="clear"/>
+            <w:tcBorders>
+              <w:top w:val="single" w:sz="4" w:color="D2D8DE"/>
+              <w:left w:val="single" w:sz="4" w:color="D2D8DE"/>
+              <w:bottom w:val="single" w:sz="4" w:color="D2D8DE"/>
+              <w:right w:val="single" w:sz="4" w:color="D2D8DE"/>
+            </w:tcBorders>
+          </w:tcPr>
+          <w:p>
+            <w:pPr>
+              <w:spacing w:before="40" w:after="40" w:lineRule="auto" w:line="300"/>
+            </w:pPr>
+            <w:r>
+              <w:rPr>
+                <w:rFonts w:ascii="Microsoft YaHei" w:hAnsi="Microsoft YaHei" w:eastAsia="Microsoft YaHei" w:cs="Microsoft YaHei"/>
+                <w:b w:val="0"/>
+                <w:color w:val="23262A"/>
+                <w:sz w:val="19"/>
+              </w:rPr>
+              <w:t>切换为英文界面</w:t>
+            </w:r>
+          </w:p>
+        </w:tc>
+      </w:tr>
+    </w:tbl>
+    <w:p/>
     <w:p>
       <w:pPr>
         <w:spacing w:before="240" w:after="120" w:lineRule="auto" w:line="300"/>
@@ -2392,7 +3073,7 @@
           <w:color w:val="23262A"/>
           <w:sz w:val="21"/>
         </w:rPr>
-        <w:t>学习成功后，屏幕自动进入空调控制页，即可开始使用。</w:t>
+        <w:t>学习成功后，屏幕自动进入「空调」控制页，即可开始使用。</w:t>
       </w:r>
     </w:p>
     <w:p>
@@ -2474,7 +3155,7 @@
           <w:color w:val="23262A"/>
           <w:sz w:val="21"/>
         </w:rPr>
-        <w:t>绑定完成后，日常控制主要通过空调控制页完成。右上角「EN / 中文」可切换界面语言。</w:t>
+        <w:t>绑定完成后，日常控制在「空调」页完成；向左滑动进入「氛围灯光」页。各页右上角「EN / 中文」可切换界面语言。</w:t>
       </w:r>
     </w:p>
     <w:p>
@@ -2543,7 +3224,543 @@
           <w:color w:val="6E747C"/>
           <w:sz w:val="18"/>
         </w:rPr>
-        <w:t>图 6-1  空调控制页示意</w:t>
+        <w:t>图 6-1  空调控制页（关机状态示例：按钮显示「开启」）</w:t>
+      </w:r>
+    </w:p>
+    <w:tbl>
+      <w:tblPr>
+        <w:tblW w:type="auto" w:w="0"/>
+        <w:jc w:val="center"/>
+        <w:tblLayout w:type="autofit"/>
+        <w:tblLook w:firstColumn="1" w:firstRow="1" w:lastColumn="0" w:lastRow="0" w:noHBand="0" w:noVBand="1" w:val="04A0"/>
+      </w:tblPr>
+      <w:tblGrid>
+        <w:gridCol w:w="4819"/>
+        <w:gridCol w:w="4819"/>
+      </w:tblGrid>
+      <w:tr>
+        <w:tc>
+          <w:tcPr>
+            <w:tcW w:type="dxa" w:w="2835"/>
+            <w:shd w:fill="183048" w:val="clear"/>
+            <w:tcBorders>
+              <w:top w:val="single" w:sz="4" w:color="D2D8DE"/>
+              <w:left w:val="single" w:sz="4" w:color="D2D8DE"/>
+              <w:bottom w:val="single" w:sz="4" w:color="D2D8DE"/>
+              <w:right w:val="single" w:sz="4" w:color="D2D8DE"/>
+            </w:tcBorders>
+          </w:tcPr>
+          <w:p>
+            <w:pPr>
+              <w:spacing w:before="60" w:after="60" w:lineRule="auto" w:line="300"/>
+              <w:jc w:val="center"/>
+            </w:pPr>
+            <w:r>
+              <w:rPr>
+                <w:rFonts w:ascii="Microsoft YaHei" w:hAnsi="Microsoft YaHei" w:eastAsia="Microsoft YaHei" w:cs="Microsoft YaHei"/>
+                <w:b/>
+                <w:color w:val="FFFFFF"/>
+                <w:sz w:val="19"/>
+              </w:rPr>
+              <w:t>屏幕元素</w:t>
+            </w:r>
+          </w:p>
+        </w:tc>
+        <w:tc>
+          <w:tcPr>
+            <w:tcW w:type="dxa" w:w="6520"/>
+            <w:shd w:fill="183048" w:val="clear"/>
+            <w:tcBorders>
+              <w:top w:val="single" w:sz="4" w:color="D2D8DE"/>
+              <w:left w:val="single" w:sz="4" w:color="D2D8DE"/>
+              <w:bottom w:val="single" w:sz="4" w:color="D2D8DE"/>
+              <w:right w:val="single" w:sz="4" w:color="D2D8DE"/>
+            </w:tcBorders>
+          </w:tcPr>
+          <w:p>
+            <w:pPr>
+              <w:spacing w:before="60" w:after="60" w:lineRule="auto" w:line="300"/>
+              <w:jc w:val="center"/>
+            </w:pPr>
+            <w:r>
+              <w:rPr>
+                <w:rFonts w:ascii="Microsoft YaHei" w:hAnsi="Microsoft YaHei" w:eastAsia="Microsoft YaHei" w:cs="Microsoft YaHei"/>
+                <w:b/>
+                <w:color w:val="FFFFFF"/>
+                <w:sz w:val="19"/>
+              </w:rPr>
+              <w:t>功能说明</w:t>
+            </w:r>
+          </w:p>
+        </w:tc>
+      </w:tr>
+      <w:tr>
+        <w:tc>
+          <w:tcPr>
+            <w:tcW w:type="dxa" w:w="2835"/>
+            <w:tcBorders>
+              <w:top w:val="single" w:sz="4" w:color="D2D8DE"/>
+              <w:left w:val="single" w:sz="4" w:color="D2D8DE"/>
+              <w:bottom w:val="single" w:sz="4" w:color="D2D8DE"/>
+              <w:right w:val="single" w:sz="4" w:color="D2D8DE"/>
+            </w:tcBorders>
+          </w:tcPr>
+          <w:p>
+            <w:pPr>
+              <w:spacing w:before="40" w:after="40" w:lineRule="auto" w:line="300"/>
+            </w:pPr>
+            <w:r>
+              <w:rPr>
+                <w:rFonts w:ascii="Microsoft YaHei" w:hAnsi="Microsoft YaHei" w:eastAsia="Microsoft YaHei" w:cs="Microsoft YaHei"/>
+                <w:b w:val="0"/>
+                <w:color w:val="23262A"/>
+                <w:sz w:val="19"/>
+              </w:rPr>
+              <w:t>标题「空调」</w:t>
+            </w:r>
+          </w:p>
+        </w:tc>
+        <w:tc>
+          <w:tcPr>
+            <w:tcW w:type="dxa" w:w="6520"/>
+            <w:tcBorders>
+              <w:top w:val="single" w:sz="4" w:color="D2D8DE"/>
+              <w:left w:val="single" w:sz="4" w:color="D2D8DE"/>
+              <w:bottom w:val="single" w:sz="4" w:color="D2D8DE"/>
+              <w:right w:val="single" w:sz="4" w:color="D2D8DE"/>
+            </w:tcBorders>
+          </w:tcPr>
+          <w:p>
+            <w:pPr>
+              <w:spacing w:before="40" w:after="40" w:lineRule="auto" w:line="300"/>
+            </w:pPr>
+            <w:r>
+              <w:rPr>
+                <w:rFonts w:ascii="Microsoft YaHei" w:hAnsi="Microsoft YaHei" w:eastAsia="Microsoft YaHei" w:cs="Microsoft YaHei"/>
+                <w:b w:val="0"/>
+                <w:color w:val="23262A"/>
+                <w:sz w:val="19"/>
+              </w:rPr>
+              <w:t>当前为空调控制界面</w:t>
+            </w:r>
+          </w:p>
+        </w:tc>
+      </w:tr>
+      <w:tr>
+        <w:tc>
+          <w:tcPr>
+            <w:tcW w:type="dxa" w:w="2835"/>
+            <w:shd w:fill="F8FAFC" w:val="clear"/>
+            <w:tcBorders>
+              <w:top w:val="single" w:sz="4" w:color="D2D8DE"/>
+              <w:left w:val="single" w:sz="4" w:color="D2D8DE"/>
+              <w:bottom w:val="single" w:sz="4" w:color="D2D8DE"/>
+              <w:right w:val="single" w:sz="4" w:color="D2D8DE"/>
+            </w:tcBorders>
+          </w:tcPr>
+          <w:p>
+            <w:pPr>
+              <w:spacing w:before="40" w:after="40" w:lineRule="auto" w:line="300"/>
+            </w:pPr>
+            <w:r>
+              <w:rPr>
+                <w:rFonts w:ascii="Microsoft YaHei" w:hAnsi="Microsoft YaHei" w:eastAsia="Microsoft YaHei" w:cs="Microsoft YaHei"/>
+                <w:b w:val="0"/>
+                <w:color w:val="23262A"/>
+                <w:sz w:val="19"/>
+              </w:rPr>
+              <w:t>副标题 / 底部「左滑灯光」</w:t>
+            </w:r>
+          </w:p>
+        </w:tc>
+        <w:tc>
+          <w:tcPr>
+            <w:tcW w:type="dxa" w:w="6520"/>
+            <w:shd w:fill="F8FAFC" w:val="clear"/>
+            <w:tcBorders>
+              <w:top w:val="single" w:sz="4" w:color="D2D8DE"/>
+              <w:left w:val="single" w:sz="4" w:color="D2D8DE"/>
+              <w:bottom w:val="single" w:sz="4" w:color="D2D8DE"/>
+              <w:right w:val="single" w:sz="4" w:color="D2D8DE"/>
+            </w:tcBorders>
+          </w:tcPr>
+          <w:p>
+            <w:pPr>
+              <w:spacing w:before="40" w:after="40" w:lineRule="auto" w:line="300"/>
+            </w:pPr>
+            <w:r>
+              <w:rPr>
+                <w:rFonts w:ascii="Microsoft YaHei" w:hAnsi="Microsoft YaHei" w:eastAsia="Microsoft YaHei" w:cs="Microsoft YaHei"/>
+                <w:b w:val="0"/>
+                <w:color w:val="23262A"/>
+                <w:sz w:val="19"/>
+              </w:rPr>
+              <w:t>提示可向左滑动进入氛围灯光页</w:t>
+            </w:r>
+          </w:p>
+        </w:tc>
+      </w:tr>
+      <w:tr>
+        <w:tc>
+          <w:tcPr>
+            <w:tcW w:type="dxa" w:w="2835"/>
+            <w:tcBorders>
+              <w:top w:val="single" w:sz="4" w:color="D2D8DE"/>
+              <w:left w:val="single" w:sz="4" w:color="D2D8DE"/>
+              <w:bottom w:val="single" w:sz="4" w:color="D2D8DE"/>
+              <w:right w:val="single" w:sz="4" w:color="D2D8DE"/>
+            </w:tcBorders>
+          </w:tcPr>
+          <w:p>
+            <w:pPr>
+              <w:spacing w:before="40" w:after="40" w:lineRule="auto" w:line="300"/>
+            </w:pPr>
+            <w:r>
+              <w:rPr>
+                <w:rFonts w:ascii="Microsoft YaHei" w:hAnsi="Microsoft YaHei" w:eastAsia="Microsoft YaHei" w:cs="Microsoft YaHei"/>
+                <w:b w:val="0"/>
+                <w:color w:val="23262A"/>
+                <w:sz w:val="19"/>
+              </w:rPr>
+              <w:t>设定温度（如 25°）</w:t>
+            </w:r>
+          </w:p>
+        </w:tc>
+        <w:tc>
+          <w:tcPr>
+            <w:tcW w:type="dxa" w:w="6520"/>
+            <w:tcBorders>
+              <w:top w:val="single" w:sz="4" w:color="D2D8DE"/>
+              <w:left w:val="single" w:sz="4" w:color="D2D8DE"/>
+              <w:bottom w:val="single" w:sz="4" w:color="D2D8DE"/>
+              <w:right w:val="single" w:sz="4" w:color="D2D8DE"/>
+            </w:tcBorders>
+          </w:tcPr>
+          <w:p>
+            <w:pPr>
+              <w:spacing w:before="40" w:after="40" w:lineRule="auto" w:line="300"/>
+            </w:pPr>
+            <w:r>
+              <w:rPr>
+                <w:rFonts w:ascii="Microsoft YaHei" w:hAnsi="Microsoft YaHei" w:eastAsia="Microsoft YaHei" w:cs="Microsoft YaHei"/>
+                <w:b w:val="0"/>
+                <w:color w:val="23262A"/>
+                <w:sz w:val="19"/>
+              </w:rPr>
+              <w:t>显示目标设定温度，单位为整度 ℃</w:t>
+            </w:r>
+          </w:p>
+        </w:tc>
+      </w:tr>
+      <w:tr>
+        <w:tc>
+          <w:tcPr>
+            <w:tcW w:type="dxa" w:w="2835"/>
+            <w:shd w:fill="F8FAFC" w:val="clear"/>
+            <w:tcBorders>
+              <w:top w:val="single" w:sz="4" w:color="D2D8DE"/>
+              <w:left w:val="single" w:sz="4" w:color="D2D8DE"/>
+              <w:bottom w:val="single" w:sz="4" w:color="D2D8DE"/>
+              <w:right w:val="single" w:sz="4" w:color="D2D8DE"/>
+            </w:tcBorders>
+          </w:tcPr>
+          <w:p>
+            <w:pPr>
+              <w:spacing w:before="40" w:after="40" w:lineRule="auto" w:line="300"/>
+            </w:pPr>
+            <w:r>
+              <w:rPr>
+                <w:rFonts w:ascii="Microsoft YaHei" w:hAnsi="Microsoft YaHei" w:eastAsia="Microsoft YaHei" w:cs="Microsoft YaHei"/>
+                <w:b w:val="0"/>
+                <w:color w:val="23262A"/>
+                <w:sz w:val="19"/>
+              </w:rPr>
+              <w:t>绿色「开启」/「关闭」</w:t>
+            </w:r>
+          </w:p>
+        </w:tc>
+        <w:tc>
+          <w:tcPr>
+            <w:tcW w:type="dxa" w:w="6520"/>
+            <w:shd w:fill="F8FAFC" w:val="clear"/>
+            <w:tcBorders>
+              <w:top w:val="single" w:sz="4" w:color="D2D8DE"/>
+              <w:left w:val="single" w:sz="4" w:color="D2D8DE"/>
+              <w:bottom w:val="single" w:sz="4" w:color="D2D8DE"/>
+              <w:right w:val="single" w:sz="4" w:color="D2D8DE"/>
+            </w:tcBorders>
+          </w:tcPr>
+          <w:p>
+            <w:pPr>
+              <w:spacing w:before="40" w:after="40" w:lineRule="auto" w:line="300"/>
+            </w:pPr>
+            <w:r>
+              <w:rPr>
+                <w:rFonts w:ascii="Microsoft YaHei" w:hAnsi="Microsoft YaHei" w:eastAsia="Microsoft YaHei" w:cs="Microsoft YaHei"/>
+                <w:b w:val="0"/>
+                <w:color w:val="23262A"/>
+                <w:sz w:val="19"/>
+              </w:rPr>
+              <w:t>空调关闭时显示「开启」，开启时显示「关闭」；点按切换开关</w:t>
+            </w:r>
+          </w:p>
+        </w:tc>
+      </w:tr>
+      <w:tr>
+        <w:tc>
+          <w:tcPr>
+            <w:tcW w:type="dxa" w:w="2835"/>
+            <w:tcBorders>
+              <w:top w:val="single" w:sz="4" w:color="D2D8DE"/>
+              <w:left w:val="single" w:sz="4" w:color="D2D8DE"/>
+              <w:bottom w:val="single" w:sz="4" w:color="D2D8DE"/>
+              <w:right w:val="single" w:sz="4" w:color="D2D8DE"/>
+            </w:tcBorders>
+          </w:tcPr>
+          <w:p>
+            <w:pPr>
+              <w:spacing w:before="40" w:after="40" w:lineRule="auto" w:line="300"/>
+            </w:pPr>
+            <w:r>
+              <w:rPr>
+                <w:rFonts w:ascii="Microsoft YaHei" w:hAnsi="Microsoft YaHei" w:eastAsia="Microsoft YaHei" w:cs="Microsoft YaHei"/>
+                <w:b w:val="0"/>
+                <w:color w:val="23262A"/>
+                <w:sz w:val="19"/>
+              </w:rPr>
+              <w:t>「降温」</w:t>
+            </w:r>
+          </w:p>
+        </w:tc>
+        <w:tc>
+          <w:tcPr>
+            <w:tcW w:type="dxa" w:w="6520"/>
+            <w:tcBorders>
+              <w:top w:val="single" w:sz="4" w:color="D2D8DE"/>
+              <w:left w:val="single" w:sz="4" w:color="D2D8DE"/>
+              <w:bottom w:val="single" w:sz="4" w:color="D2D8DE"/>
+              <w:right w:val="single" w:sz="4" w:color="D2D8DE"/>
+            </w:tcBorders>
+          </w:tcPr>
+          <w:p>
+            <w:pPr>
+              <w:spacing w:before="40" w:after="40" w:lineRule="auto" w:line="300"/>
+            </w:pPr>
+            <w:r>
+              <w:rPr>
+                <w:rFonts w:ascii="Microsoft YaHei" w:hAnsi="Microsoft YaHei" w:eastAsia="Microsoft YaHei" w:cs="Microsoft YaHei"/>
+                <w:b w:val="0"/>
+                <w:color w:val="23262A"/>
+                <w:sz w:val="19"/>
+              </w:rPr>
+              <w:t>设定温度降低 1℃，并向空调发送红外指令</w:t>
+            </w:r>
+          </w:p>
+        </w:tc>
+      </w:tr>
+      <w:tr>
+        <w:tc>
+          <w:tcPr>
+            <w:tcW w:type="dxa" w:w="2835"/>
+            <w:shd w:fill="F8FAFC" w:val="clear"/>
+            <w:tcBorders>
+              <w:top w:val="single" w:sz="4" w:color="D2D8DE"/>
+              <w:left w:val="single" w:sz="4" w:color="D2D8DE"/>
+              <w:bottom w:val="single" w:sz="4" w:color="D2D8DE"/>
+              <w:right w:val="single" w:sz="4" w:color="D2D8DE"/>
+            </w:tcBorders>
+          </w:tcPr>
+          <w:p>
+            <w:pPr>
+              <w:spacing w:before="40" w:after="40" w:lineRule="auto" w:line="300"/>
+            </w:pPr>
+            <w:r>
+              <w:rPr>
+                <w:rFonts w:ascii="Microsoft YaHei" w:hAnsi="Microsoft YaHei" w:eastAsia="Microsoft YaHei" w:cs="Microsoft YaHei"/>
+                <w:b w:val="0"/>
+                <w:color w:val="23262A"/>
+                <w:sz w:val="19"/>
+              </w:rPr>
+              <w:t>「升温」</w:t>
+            </w:r>
+          </w:p>
+        </w:tc>
+        <w:tc>
+          <w:tcPr>
+            <w:tcW w:type="dxa" w:w="6520"/>
+            <w:shd w:fill="F8FAFC" w:val="clear"/>
+            <w:tcBorders>
+              <w:top w:val="single" w:sz="4" w:color="D2D8DE"/>
+              <w:left w:val="single" w:sz="4" w:color="D2D8DE"/>
+              <w:bottom w:val="single" w:sz="4" w:color="D2D8DE"/>
+              <w:right w:val="single" w:sz="4" w:color="D2D8DE"/>
+            </w:tcBorders>
+          </w:tcPr>
+          <w:p>
+            <w:pPr>
+              <w:spacing w:before="40" w:after="40" w:lineRule="auto" w:line="300"/>
+            </w:pPr>
+            <w:r>
+              <w:rPr>
+                <w:rFonts w:ascii="Microsoft YaHei" w:hAnsi="Microsoft YaHei" w:eastAsia="Microsoft YaHei" w:cs="Microsoft YaHei"/>
+                <w:b w:val="0"/>
+                <w:color w:val="23262A"/>
+                <w:sz w:val="19"/>
+              </w:rPr>
+              <w:t>设定温度升高 1℃，并向空调发送红外指令</w:t>
+            </w:r>
+          </w:p>
+        </w:tc>
+      </w:tr>
+      <w:tr>
+        <w:tc>
+          <w:tcPr>
+            <w:tcW w:type="dxa" w:w="2835"/>
+            <w:tcBorders>
+              <w:top w:val="single" w:sz="4" w:color="D2D8DE"/>
+              <w:left w:val="single" w:sz="4" w:color="D2D8DE"/>
+              <w:bottom w:val="single" w:sz="4" w:color="D2D8DE"/>
+              <w:right w:val="single" w:sz="4" w:color="D2D8DE"/>
+            </w:tcBorders>
+          </w:tcPr>
+          <w:p>
+            <w:pPr>
+              <w:spacing w:before="40" w:after="40" w:lineRule="auto" w:line="300"/>
+            </w:pPr>
+            <w:r>
+              <w:rPr>
+                <w:rFonts w:ascii="Microsoft YaHei" w:hAnsi="Microsoft YaHei" w:eastAsia="Microsoft YaHei" w:cs="Microsoft YaHei"/>
+                <w:b w:val="0"/>
+                <w:color w:val="23262A"/>
+                <w:sz w:val="19"/>
+              </w:rPr>
+              <w:t>右上角「EN」</w:t>
+            </w:r>
+          </w:p>
+        </w:tc>
+        <w:tc>
+          <w:tcPr>
+            <w:tcW w:type="dxa" w:w="6520"/>
+            <w:tcBorders>
+              <w:top w:val="single" w:sz="4" w:color="D2D8DE"/>
+              <w:left w:val="single" w:sz="4" w:color="D2D8DE"/>
+              <w:bottom w:val="single" w:sz="4" w:color="D2D8DE"/>
+              <w:right w:val="single" w:sz="4" w:color="D2D8DE"/>
+            </w:tcBorders>
+          </w:tcPr>
+          <w:p>
+            <w:pPr>
+              <w:spacing w:before="40" w:after="40" w:lineRule="auto" w:line="300"/>
+            </w:pPr>
+            <w:r>
+              <w:rPr>
+                <w:rFonts w:ascii="Microsoft YaHei" w:hAnsi="Microsoft YaHei" w:eastAsia="Microsoft YaHei" w:cs="Microsoft YaHei"/>
+                <w:b w:val="0"/>
+                <w:color w:val="23262A"/>
+                <w:sz w:val="19"/>
+              </w:rPr>
+              <w:t>切换为英文界面</w:t>
+            </w:r>
+          </w:p>
+        </w:tc>
+      </w:tr>
+    </w:tbl>
+    <w:p/>
+    <w:p>
+      <w:pPr>
+        <w:spacing w:before="0" w:after="120" w:lineRule="auto" w:line="300"/>
+      </w:pPr>
+      <w:r>
+        <w:rPr>
+          <w:rFonts w:ascii="Microsoft YaHei" w:hAnsi="Microsoft YaHei" w:eastAsia="Microsoft YaHei" w:cs="Microsoft YaHei"/>
+          <w:b w:val="0"/>
+          <w:color w:val="23262A"/>
+          <w:sz w:val="21"/>
+        </w:rPr>
+        <w:t>屏上开关与设定温度与手机智能家居 App 双向同步；任一侧更改都会反映到另一侧。</w:t>
+      </w:r>
+    </w:p>
+    <w:p>
+      <w:pPr>
+        <w:spacing w:before="240" w:after="120" w:lineRule="auto" w:line="300"/>
+      </w:pPr>
+      <w:r>
+        <w:rPr>
+          <w:rFonts w:ascii="Microsoft YaHei" w:hAnsi="Microsoft YaHei" w:eastAsia="Microsoft YaHei" w:cs="Microsoft YaHei"/>
+          <w:b/>
+          <w:color w:val="244060"/>
+          <w:sz w:val="25"/>
+        </w:rPr>
+        <w:t>6.2 氛围灯光页</w:t>
+      </w:r>
+    </w:p>
+    <w:p>
+      <w:pPr>
+        <w:spacing w:before="0" w:after="120" w:lineRule="auto" w:line="300"/>
+      </w:pPr>
+      <w:r>
+        <w:rPr>
+          <w:rFonts w:ascii="Microsoft YaHei" w:hAnsi="Microsoft YaHei" w:eastAsia="Microsoft YaHei" w:cs="Microsoft YaHei"/>
+          <w:b w:val="0"/>
+          <w:color w:val="23262A"/>
+          <w:sz w:val="21"/>
+        </w:rPr>
+        <w:t>在空调控制页向左滑动进入本页；向右滑动返回「空调」页。</w:t>
+      </w:r>
+    </w:p>
+    <w:p>
+      <w:pPr>
+        <w:spacing w:before="120" w:after="40" w:lineRule="auto" w:line="300"/>
+        <w:jc w:val="center"/>
+      </w:pPr>
+      <w:r>
+        <w:drawing>
+          <wp:inline xmlns:a="http://schemas.openxmlformats.org/drawingml/2006/main" xmlns:pic="http://schemas.openxmlformats.org/drawingml/2006/picture">
+            <wp:extent cx="3060000" cy="3060000"/>
+            <wp:docPr id="13" name="Picture 13"/>
+            <wp:cNvGraphicFramePr>
+              <a:graphicFrameLocks noChangeAspect="1"/>
+            </wp:cNvGraphicFramePr>
+            <a:graphic>
+              <a:graphicData uri="http://schemas.openxmlformats.org/drawingml/2006/picture">
+                <pic:pic>
+                  <pic:nvPicPr>
+                    <pic:cNvPr id="0" name="ui_light_on_device_pdf.jpg"/>
+                    <pic:cNvPicPr/>
+                  </pic:nvPicPr>
+                  <pic:blipFill>
+                    <a:blip r:embed="rId16"/>
+                    <a:stretch>
+                      <a:fillRect/>
+                    </a:stretch>
+                  </pic:blipFill>
+                  <pic:spPr>
+                    <a:xfrm>
+                      <a:off x="0" y="0"/>
+                      <a:ext cx="3060000" cy="3060000"/>
+                    </a:xfrm>
+                    <a:prstGeom prst="rect"/>
+                  </pic:spPr>
+                </pic:pic>
+              </a:graphicData>
+            </a:graphic>
+          </wp:inline>
+        </w:drawing>
+      </w:r>
+    </w:p>
+    <w:p>
+      <w:pPr>
+        <w:spacing w:before="40" w:after="200" w:lineRule="auto" w:line="300"/>
+        <w:jc w:val="center"/>
+      </w:pPr>
+      <w:r>
+        <w:rPr>
+          <w:rFonts w:ascii="Microsoft YaHei" w:hAnsi="Microsoft YaHei" w:eastAsia="Microsoft YaHei" w:cs="Microsoft YaHei"/>
+          <w:b w:val="0"/>
+          <w:color w:val="6E747C"/>
+          <w:sz w:val="18"/>
+        </w:rPr>
+        <w:t>图 6-2  氛围灯光页</w:t>
       </w:r>
     </w:p>
     <w:tbl>
@@ -2608,7 +3825,7 @@
                 <w:color w:val="FFFFFF"/>
                 <w:sz w:val="19"/>
               </w:rPr>
-              <w:t>操作说明</w:t>
+              <w:t>功能说明</w:t>
             </w:r>
           </w:p>
         </w:tc>
@@ -2635,7 +3852,7 @@
                 <w:color w:val="23262A"/>
                 <w:sz w:val="19"/>
               </w:rPr>
-              <w:t>标题「空调」</w:t>
+              <w:t>标题「氛围灯光」</w:t>
             </w:r>
           </w:p>
         </w:tc>
@@ -2660,7 +3877,7 @@
                 <w:color w:val="23262A"/>
                 <w:sz w:val="19"/>
               </w:rPr>
-              <w:t>表示当前为空调控制界面</w:t>
+              <w:t>当前为灯环模式与亮度设置界面</w:t>
             </w:r>
           </w:p>
         </w:tc>
@@ -2688,7 +3905,7 @@
                 <w:color w:val="23262A"/>
                 <w:sz w:val="19"/>
               </w:rPr>
-              <w:t>温度显示</w:t>
+              <w:t>副标题「亮度」</w:t>
             </w:r>
           </w:p>
         </w:tc>
@@ -2714,7 +3931,7 @@
                 <w:color w:val="23262A"/>
                 <w:sz w:val="19"/>
               </w:rPr>
-              <w:t>显示当前设定温度（整度）</w:t>
+              <w:t>提示下方滑条用于调节亮度</w:t>
             </w:r>
           </w:p>
         </w:tc>
@@ -2741,7 +3958,7 @@
                 <w:color w:val="23262A"/>
                 <w:sz w:val="19"/>
               </w:rPr>
-              <w:t>「开启 / 关闭」</w:t>
+              <w:t>六种模式按钮</w:t>
             </w:r>
           </w:p>
         </w:tc>
@@ -2766,7 +3983,7 @@
                 <w:color w:val="23262A"/>
                 <w:sz w:val="19"/>
               </w:rPr>
-              <w:t>点按切换空调电源状态</w:t>
+              <w:t>点按切换灯环效果（见下表）</w:t>
             </w:r>
           </w:p>
         </w:tc>
@@ -2794,7 +4011,7 @@
                 <w:color w:val="23262A"/>
                 <w:sz w:val="19"/>
               </w:rPr>
-              <w:t>「降温」「升温」</w:t>
+              <w:t>底部亮度滑条</w:t>
             </w:r>
           </w:p>
         </w:tc>
@@ -2820,7 +4037,7 @@
                 <w:color w:val="23262A"/>
                 <w:sz w:val="19"/>
               </w:rPr>
-              <w:t>以 1℃ 为步进调节设定温度</w:t>
+              <w:t>调节灯环明暗；与手机端亮度控制对应</w:t>
             </w:r>
           </w:p>
         </w:tc>
@@ -2847,7 +4064,7 @@
                 <w:color w:val="23262A"/>
                 <w:sz w:val="19"/>
               </w:rPr>
-              <w:t>「EN」语言按钮</w:t>
+              <w:t>右上角「EN」</w:t>
             </w:r>
           </w:p>
         </w:tc>
@@ -2872,7 +4089,7 @@
                 <w:color w:val="23262A"/>
                 <w:sz w:val="19"/>
               </w:rPr>
-              <w:t>点按切换中文 / 英文界面</w:t>
+              <w:t>切换为英文界面</w:t>
             </w:r>
           </w:p>
         </w:tc>
@@ -2900,7 +4117,7 @@
                 <w:color w:val="23262A"/>
                 <w:sz w:val="19"/>
               </w:rPr>
-              <w:t>「左滑灯光」提示</w:t>
+              <w:t>向右滑动</w:t>
             </w:r>
           </w:p>
         </w:tc>
@@ -2926,110 +4143,13 @@
                 <w:color w:val="23262A"/>
                 <w:sz w:val="19"/>
               </w:rPr>
-              <w:t>向左滑动进入氛围灯光页</w:t>
+              <w:t>返回空调控制页</w:t>
             </w:r>
           </w:p>
         </w:tc>
       </w:tr>
     </w:tbl>
     <w:p/>
-    <w:p>
-      <w:pPr>
-        <w:spacing w:before="0" w:after="120" w:lineRule="auto" w:line="300"/>
-      </w:pPr>
-      <w:r>
-        <w:rPr>
-          <w:rFonts w:ascii="Microsoft YaHei" w:hAnsi="Microsoft YaHei" w:eastAsia="Microsoft YaHei" w:cs="Microsoft YaHei"/>
-          <w:b w:val="0"/>
-          <w:color w:val="23262A"/>
-          <w:sz w:val="21"/>
-        </w:rPr>
-        <w:t>屏上状态与手机智能家居 App 中的控制状态双向同步，任一侧更改都会反映到另一侧。</w:t>
-      </w:r>
-    </w:p>
-    <w:p>
-      <w:pPr>
-        <w:spacing w:before="240" w:after="120" w:lineRule="auto" w:line="300"/>
-      </w:pPr>
-      <w:r>
-        <w:rPr>
-          <w:rFonts w:ascii="Microsoft YaHei" w:hAnsi="Microsoft YaHei" w:eastAsia="Microsoft YaHei" w:cs="Microsoft YaHei"/>
-          <w:b/>
-          <w:color w:val="244060"/>
-          <w:sz w:val="25"/>
-        </w:rPr>
-        <w:t>6.2 氛围灯光页</w:t>
-      </w:r>
-    </w:p>
-    <w:p>
-      <w:pPr>
-        <w:spacing w:before="0" w:after="120" w:lineRule="auto" w:line="300"/>
-      </w:pPr>
-      <w:r>
-        <w:rPr>
-          <w:rFonts w:ascii="Microsoft YaHei" w:hAnsi="Microsoft YaHei" w:eastAsia="Microsoft YaHei" w:cs="Microsoft YaHei"/>
-          <w:b w:val="0"/>
-          <w:color w:val="23262A"/>
-          <w:sz w:val="21"/>
-        </w:rPr>
-        <w:t>在空调控制页向左滑动，进入氛围灯光页；向右滑动可返回空调页。</w:t>
-      </w:r>
-    </w:p>
-    <w:p>
-      <w:pPr>
-        <w:spacing w:before="120" w:after="40" w:lineRule="auto" w:line="300"/>
-        <w:jc w:val="center"/>
-      </w:pPr>
-      <w:r>
-        <w:drawing>
-          <wp:inline xmlns:a="http://schemas.openxmlformats.org/drawingml/2006/main" xmlns:pic="http://schemas.openxmlformats.org/drawingml/2006/picture">
-            <wp:extent cx="3060000" cy="3060000"/>
-            <wp:docPr id="13" name="Picture 13"/>
-            <wp:cNvGraphicFramePr>
-              <a:graphicFrameLocks noChangeAspect="1"/>
-            </wp:cNvGraphicFramePr>
-            <a:graphic>
-              <a:graphicData uri="http://schemas.openxmlformats.org/drawingml/2006/picture">
-                <pic:pic>
-                  <pic:nvPicPr>
-                    <pic:cNvPr id="0" name="ui_light_on_device_pdf.jpg"/>
-                    <pic:cNvPicPr/>
-                  </pic:nvPicPr>
-                  <pic:blipFill>
-                    <a:blip r:embed="rId16"/>
-                    <a:stretch>
-                      <a:fillRect/>
-                    </a:stretch>
-                  </pic:blipFill>
-                  <pic:spPr>
-                    <a:xfrm>
-                      <a:off x="0" y="0"/>
-                      <a:ext cx="3060000" cy="3060000"/>
-                    </a:xfrm>
-                    <a:prstGeom prst="rect"/>
-                  </pic:spPr>
-                </pic:pic>
-              </a:graphicData>
-            </a:graphic>
-          </wp:inline>
-        </w:drawing>
-      </w:r>
-    </w:p>
-    <w:p>
-      <w:pPr>
-        <w:spacing w:before="40" w:after="200" w:lineRule="auto" w:line="300"/>
-        <w:jc w:val="center"/>
-      </w:pPr>
-      <w:r>
-        <w:rPr>
-          <w:rFonts w:ascii="Microsoft YaHei" w:hAnsi="Microsoft YaHei" w:eastAsia="Microsoft YaHei" w:cs="Microsoft YaHei"/>
-          <w:b w:val="0"/>
-          <w:color w:val="6E747C"/>
-          <w:sz w:val="18"/>
-        </w:rPr>
-        <w:t>图 6-2  氛围灯光页示意</w:t>
-      </w:r>
-    </w:p>
     <w:tbl>
       <w:tblPr>
         <w:tblW w:type="auto" w:w="0"/>
@@ -3428,7 +4548,7 @@
           <w:color w:val="23262A"/>
           <w:sz w:val="21"/>
         </w:rPr>
-        <w:t>底部亮度滑条可调节灯环明暗。手机 App 可控制灯环开关与亮度；彩虹、呼吸等氛围模式仅在本机圆屏选择。</w:t>
+        <w:t>手机 App 可控制灯环开关与亮度；彩虹、呼吸等氛围模式仅在本机圆屏选择。红外学习进行中时，灯环会临时变为黄色呼吸，结束后自动恢复原模式。</w:t>
       </w:r>
     </w:p>
     <w:p>
@@ -3456,7 +4576,7 @@
           <w:color w:val="23262A"/>
           <w:sz w:val="21"/>
         </w:rPr>
-        <w:t>在任意主要界面，点按屏幕右上角「EN」可切换为英文界面；在英文界面点按「中文」可切回中文。出厂默认中文。</w:t>
+        <w:t>在任意主要界面，点按屏幕右上角「EN」切换为英文界面；在英文界面点按「中文」切回中文。出厂默认中文。</w:t>
       </w:r>
     </w:p>
     <w:p>

</xml_diff>

<commit_message>
Use official user product renders in the user manuals
Replace AI-generated product shots with the uploaded hero/studio
renders, composite firmware UI only onto the nested display, and
regenerate PDF/Word on main.

Co-authored-by: Davy <realDavy@users.noreply.github.com>
</commit_message>
<xml_diff>
--- a/docs/aidaegis_ac_remote_user_manual.docx
+++ b/docs/aidaegis_ac_remote_user_manual.docx
@@ -10,7 +10,7 @@
       <w:r>
         <w:drawing>
           <wp:inline xmlns:a="http://schemas.openxmlformats.org/drawingml/2006/main" xmlns:pic="http://schemas.openxmlformats.org/drawingml/2006/picture">
-            <wp:extent cx="5940000" cy="3960000"/>
+            <wp:extent cx="3420000" cy="5130000"/>
             <wp:docPr id="1" name="Picture 1"/>
             <wp:cNvGraphicFramePr>
               <a:graphicFrameLocks noChangeAspect="1"/>
@@ -31,7 +31,7 @@
                   <pic:spPr>
                     <a:xfrm>
                       <a:off x="0" y="0"/>
-                      <a:ext cx="5940000" cy="3960000"/>
+                      <a:ext cx="3420000" cy="5130000"/>
                     </a:xfrm>
                     <a:prstGeom prst="rect"/>
                   </pic:spPr>
@@ -478,7 +478,7 @@
       <w:r>
         <w:drawing>
           <wp:inline xmlns:a="http://schemas.openxmlformats.org/drawingml/2006/main" xmlns:pic="http://schemas.openxmlformats.org/drawingml/2006/picture">
-            <wp:extent cx="3420000" cy="3420000"/>
+            <wp:extent cx="3420000" cy="3259823"/>
             <wp:docPr id="2" name="Picture 2"/>
             <wp:cNvGraphicFramePr>
               <a:graphicFrameLocks noChangeAspect="1"/>
@@ -499,7 +499,7 @@
                   <pic:spPr>
                     <a:xfrm>
                       <a:off x="0" y="0"/>
-                      <a:ext cx="3420000" cy="3420000"/>
+                      <a:ext cx="3420000" cy="3259823"/>
                     </a:xfrm>
                     <a:prstGeom prst="rect"/>
                   </pic:spPr>
@@ -915,7 +915,7 @@
             <w:r>
               <w:drawing>
                 <wp:inline xmlns:a="http://schemas.openxmlformats.org/drawingml/2006/main" xmlns:pic="http://schemas.openxmlformats.org/drawingml/2006/picture">
-                  <wp:extent cx="2592000" cy="2592000"/>
+                  <wp:extent cx="2592000" cy="2470603"/>
                   <wp:docPr id="3" name="Picture 3"/>
                   <wp:cNvGraphicFramePr>
                     <a:graphicFrameLocks noChangeAspect="1"/>
@@ -936,7 +936,7 @@
                         <pic:spPr>
                           <a:xfrm>
                             <a:off x="0" y="0"/>
-                            <a:ext cx="2592000" cy="2592000"/>
+                            <a:ext cx="2592000" cy="2470603"/>
                           </a:xfrm>
                           <a:prstGeom prst="rect"/>
                         </pic:spPr>
@@ -965,7 +965,7 @@
             <w:r>
               <w:drawing>
                 <wp:inline xmlns:a="http://schemas.openxmlformats.org/drawingml/2006/main" xmlns:pic="http://schemas.openxmlformats.org/drawingml/2006/picture">
-                  <wp:extent cx="2592000" cy="1728000"/>
+                  <wp:extent cx="2592000" cy="2592000"/>
                   <wp:docPr id="4" name="Picture 4"/>
                   <wp:cNvGraphicFramePr>
                     <a:graphicFrameLocks noChangeAspect="1"/>
@@ -986,7 +986,7 @@
                         <pic:spPr>
                           <a:xfrm>
                             <a:off x="0" y="0"/>
-                            <a:ext cx="2592000" cy="1728000"/>
+                            <a:ext cx="2592000" cy="2592000"/>
                           </a:xfrm>
                           <a:prstGeom prst="rect"/>
                         </pic:spPr>
@@ -1522,7 +1522,7 @@
             <w:r>
               <w:drawing>
                 <wp:inline xmlns:a="http://schemas.openxmlformats.org/drawingml/2006/main" xmlns:pic="http://schemas.openxmlformats.org/drawingml/2006/picture">
-                  <wp:extent cx="2592000" cy="2592000"/>
+                  <wp:extent cx="2592000" cy="2470603"/>
                   <wp:docPr id="5" name="Picture 5"/>
                   <wp:cNvGraphicFramePr>
                     <a:graphicFrameLocks noChangeAspect="1"/>
@@ -1543,7 +1543,7 @@
                         <pic:spPr>
                           <a:xfrm>
                             <a:off x="0" y="0"/>
-                            <a:ext cx="2592000" cy="2592000"/>
+                            <a:ext cx="2592000" cy="2470603"/>
                           </a:xfrm>
                           <a:prstGeom prst="rect"/>
                         </pic:spPr>
@@ -1572,7 +1572,7 @@
             <w:r>
               <w:drawing>
                 <wp:inline xmlns:a="http://schemas.openxmlformats.org/drawingml/2006/main" xmlns:pic="http://schemas.openxmlformats.org/drawingml/2006/picture">
-                  <wp:extent cx="2592000" cy="2592000"/>
+                  <wp:extent cx="2592000" cy="2470603"/>
                   <wp:docPr id="6" name="Picture 6"/>
                   <wp:cNvGraphicFramePr>
                     <a:graphicFrameLocks noChangeAspect="1"/>
@@ -1593,7 +1593,7 @@
                         <pic:spPr>
                           <a:xfrm>
                             <a:off x="0" y="0"/>
-                            <a:ext cx="2592000" cy="2592000"/>
+                            <a:ext cx="2592000" cy="2470603"/>
                           </a:xfrm>
                           <a:prstGeom prst="rect"/>
                         </pic:spPr>
@@ -1690,7 +1690,7 @@
             <w:r>
               <w:drawing>
                 <wp:inline xmlns:a="http://schemas.openxmlformats.org/drawingml/2006/main" xmlns:pic="http://schemas.openxmlformats.org/drawingml/2006/picture">
-                  <wp:extent cx="2592000" cy="2592000"/>
+                  <wp:extent cx="2592000" cy="2470603"/>
                   <wp:docPr id="7" name="Picture 7"/>
                   <wp:cNvGraphicFramePr>
                     <a:graphicFrameLocks noChangeAspect="1"/>
@@ -1711,7 +1711,7 @@
                         <pic:spPr>
                           <a:xfrm>
                             <a:off x="0" y="0"/>
-                            <a:ext cx="2592000" cy="2592000"/>
+                            <a:ext cx="2592000" cy="2470603"/>
                           </a:xfrm>
                           <a:prstGeom prst="rect"/>
                         </pic:spPr>
@@ -1740,7 +1740,7 @@
             <w:r>
               <w:drawing>
                 <wp:inline xmlns:a="http://schemas.openxmlformats.org/drawingml/2006/main" xmlns:pic="http://schemas.openxmlformats.org/drawingml/2006/picture">
-                  <wp:extent cx="2592000" cy="2592000"/>
+                  <wp:extent cx="2592000" cy="2470603"/>
                   <wp:docPr id="8" name="Picture 8"/>
                   <wp:cNvGraphicFramePr>
                     <a:graphicFrameLocks noChangeAspect="1"/>
@@ -1761,7 +1761,7 @@
                         <pic:spPr>
                           <a:xfrm>
                             <a:off x="0" y="0"/>
-                            <a:ext cx="2592000" cy="2592000"/>
+                            <a:ext cx="2592000" cy="2470603"/>
                           </a:xfrm>
                           <a:prstGeom prst="rect"/>
                         </pic:spPr>
@@ -1980,7 +1980,7 @@
       <w:r>
         <w:drawing>
           <wp:inline xmlns:a="http://schemas.openxmlformats.org/drawingml/2006/main" xmlns:pic="http://schemas.openxmlformats.org/drawingml/2006/picture">
-            <wp:extent cx="5400000" cy="3600000"/>
+            <wp:extent cx="3240000" cy="4860000"/>
             <wp:docPr id="9" name="Picture 9"/>
             <wp:cNvGraphicFramePr>
               <a:graphicFrameLocks noChangeAspect="1"/>
@@ -2001,7 +2001,7 @@
                   <pic:spPr>
                     <a:xfrm>
                       <a:off x="0" y="0"/>
-                      <a:ext cx="5400000" cy="3600000"/>
+                      <a:ext cx="3240000" cy="4860000"/>
                     </a:xfrm>
                     <a:prstGeom prst="rect"/>
                   </pic:spPr>
@@ -2102,7 +2102,7 @@
       <w:r>
         <w:drawing>
           <wp:inline xmlns:a="http://schemas.openxmlformats.org/drawingml/2006/main" xmlns:pic="http://schemas.openxmlformats.org/drawingml/2006/picture">
-            <wp:extent cx="3060000" cy="3060000"/>
+            <wp:extent cx="3060000" cy="2916684"/>
             <wp:docPr id="10" name="Picture 10"/>
             <wp:cNvGraphicFramePr>
               <a:graphicFrameLocks noChangeAspect="1"/>
@@ -2123,7 +2123,7 @@
                   <pic:spPr>
                     <a:xfrm>
                       <a:off x="0" y="0"/>
-                      <a:ext cx="3060000" cy="3060000"/>
+                      <a:ext cx="3060000" cy="2916684"/>
                     </a:xfrm>
                     <a:prstGeom prst="rect"/>
                   </pic:spPr>
@@ -2675,7 +2675,7 @@
       <w:r>
         <w:drawing>
           <wp:inline xmlns:a="http://schemas.openxmlformats.org/drawingml/2006/main" xmlns:pic="http://schemas.openxmlformats.org/drawingml/2006/picture">
-            <wp:extent cx="3060000" cy="3060000"/>
+            <wp:extent cx="3060000" cy="2916684"/>
             <wp:docPr id="11" name="Picture 11"/>
             <wp:cNvGraphicFramePr>
               <a:graphicFrameLocks noChangeAspect="1"/>
@@ -2696,7 +2696,7 @@
                   <pic:spPr>
                     <a:xfrm>
                       <a:off x="0" y="0"/>
-                      <a:ext cx="3060000" cy="3060000"/>
+                      <a:ext cx="3060000" cy="2916684"/>
                     </a:xfrm>
                     <a:prstGeom prst="rect"/>
                   </pic:spPr>
@@ -3180,7 +3180,7 @@
       <w:r>
         <w:drawing>
           <wp:inline xmlns:a="http://schemas.openxmlformats.org/drawingml/2006/main" xmlns:pic="http://schemas.openxmlformats.org/drawingml/2006/picture">
-            <wp:extent cx="3060000" cy="3060000"/>
+            <wp:extent cx="3060000" cy="2916684"/>
             <wp:docPr id="12" name="Picture 12"/>
             <wp:cNvGraphicFramePr>
               <a:graphicFrameLocks noChangeAspect="1"/>
@@ -3201,7 +3201,7 @@
                   <pic:spPr>
                     <a:xfrm>
                       <a:off x="0" y="0"/>
-                      <a:ext cx="3060000" cy="3060000"/>
+                      <a:ext cx="3060000" cy="2916684"/>
                     </a:xfrm>
                     <a:prstGeom prst="rect"/>
                   </pic:spPr>
@@ -3716,7 +3716,7 @@
       <w:r>
         <w:drawing>
           <wp:inline xmlns:a="http://schemas.openxmlformats.org/drawingml/2006/main" xmlns:pic="http://schemas.openxmlformats.org/drawingml/2006/picture">
-            <wp:extent cx="3060000" cy="3060000"/>
+            <wp:extent cx="3060000" cy="2916684"/>
             <wp:docPr id="13" name="Picture 13"/>
             <wp:cNvGraphicFramePr>
               <a:graphicFrameLocks noChangeAspect="1"/>
@@ -3737,7 +3737,7 @@
                   <pic:spPr>
                     <a:xfrm>
                       <a:off x="0" y="0"/>
-                      <a:ext cx="3060000" cy="3060000"/>
+                      <a:ext cx="3060000" cy="2916684"/>
                     </a:xfrm>
                     <a:prstGeom prst="rect"/>
                   </pic:spPr>
@@ -4983,7 +4983,7 @@
             <w:r>
               <w:drawing>
                 <wp:inline xmlns:a="http://schemas.openxmlformats.org/drawingml/2006/main" xmlns:pic="http://schemas.openxmlformats.org/drawingml/2006/picture">
-                  <wp:extent cx="2592000" cy="2592000"/>
+                  <wp:extent cx="2592000" cy="2470603"/>
                   <wp:docPr id="14" name="Picture 14"/>
                   <wp:cNvGraphicFramePr>
                     <a:graphicFrameLocks noChangeAspect="1"/>
@@ -5004,7 +5004,7 @@
                         <pic:spPr>
                           <a:xfrm>
                             <a:off x="0" y="0"/>
-                            <a:ext cx="2592000" cy="2592000"/>
+                            <a:ext cx="2592000" cy="2470603"/>
                           </a:xfrm>
                           <a:prstGeom prst="rect"/>
                         </pic:spPr>
@@ -5033,7 +5033,7 @@
             <w:r>
               <w:drawing>
                 <wp:inline xmlns:a="http://schemas.openxmlformats.org/drawingml/2006/main" xmlns:pic="http://schemas.openxmlformats.org/drawingml/2006/picture">
-                  <wp:extent cx="2592000" cy="2592000"/>
+                  <wp:extent cx="2592000" cy="2470603"/>
                   <wp:docPr id="15" name="Picture 15"/>
                   <wp:cNvGraphicFramePr>
                     <a:graphicFrameLocks noChangeAspect="1"/>
@@ -5054,7 +5054,7 @@
                         <pic:spPr>
                           <a:xfrm>
                             <a:off x="0" y="0"/>
-                            <a:ext cx="2592000" cy="2592000"/>
+                            <a:ext cx="2592000" cy="2470603"/>
                           </a:xfrm>
                           <a:prstGeom prst="rect"/>
                         </pic:spPr>

</xml_diff>

<commit_message>
Fix manual figure alignment and round-screen UI overflow
Recalibrate nested-display compositing on the official studio render,
draw firmware UI inside a safe circular inset, square-pad plates to a
common canvas, and blank the side-view screen so perspective UI no
longer spills past the bezel.

Co-authored-by: Davy <realDavy@users.noreply.github.com>
</commit_message>
<xml_diff>
--- a/docs/aidaegis_ac_remote_user_manual.docx
+++ b/docs/aidaegis_ac_remote_user_manual.docx
@@ -10,7 +10,7 @@
       <w:r>
         <w:drawing>
           <wp:inline xmlns:a="http://schemas.openxmlformats.org/drawingml/2006/main" xmlns:pic="http://schemas.openxmlformats.org/drawingml/2006/picture">
-            <wp:extent cx="3420000" cy="5130000"/>
+            <wp:extent cx="3420000" cy="5131833"/>
             <wp:docPr id="1" name="Picture 1"/>
             <wp:cNvGraphicFramePr>
               <a:graphicFrameLocks noChangeAspect="1"/>
@@ -31,7 +31,7 @@
                   <pic:spPr>
                     <a:xfrm>
                       <a:off x="0" y="0"/>
-                      <a:ext cx="3420000" cy="5130000"/>
+                      <a:ext cx="3420000" cy="5131833"/>
                     </a:xfrm>
                     <a:prstGeom prst="rect"/>
                   </pic:spPr>
@@ -478,7 +478,7 @@
       <w:r>
         <w:drawing>
           <wp:inline xmlns:a="http://schemas.openxmlformats.org/drawingml/2006/main" xmlns:pic="http://schemas.openxmlformats.org/drawingml/2006/picture">
-            <wp:extent cx="3420000" cy="3259823"/>
+            <wp:extent cx="3420000" cy="3420000"/>
             <wp:docPr id="2" name="Picture 2"/>
             <wp:cNvGraphicFramePr>
               <a:graphicFrameLocks noChangeAspect="1"/>
@@ -499,7 +499,7 @@
                   <pic:spPr>
                     <a:xfrm>
                       <a:off x="0" y="0"/>
-                      <a:ext cx="3420000" cy="3259823"/>
+                      <a:ext cx="3420000" cy="3420000"/>
                     </a:xfrm>
                     <a:prstGeom prst="rect"/>
                   </pic:spPr>
@@ -915,7 +915,7 @@
             <w:r>
               <w:drawing>
                 <wp:inline xmlns:a="http://schemas.openxmlformats.org/drawingml/2006/main" xmlns:pic="http://schemas.openxmlformats.org/drawingml/2006/picture">
-                  <wp:extent cx="2592000" cy="2470603"/>
+                  <wp:extent cx="2592000" cy="2592000"/>
                   <wp:docPr id="3" name="Picture 3"/>
                   <wp:cNvGraphicFramePr>
                     <a:graphicFrameLocks noChangeAspect="1"/>
@@ -936,7 +936,7 @@
                         <pic:spPr>
                           <a:xfrm>
                             <a:off x="0" y="0"/>
-                            <a:ext cx="2592000" cy="2470603"/>
+                            <a:ext cx="2592000" cy="2592000"/>
                           </a:xfrm>
                           <a:prstGeom prst="rect"/>
                         </pic:spPr>
@@ -1522,7 +1522,7 @@
             <w:r>
               <w:drawing>
                 <wp:inline xmlns:a="http://schemas.openxmlformats.org/drawingml/2006/main" xmlns:pic="http://schemas.openxmlformats.org/drawingml/2006/picture">
-                  <wp:extent cx="2592000" cy="2470603"/>
+                  <wp:extent cx="2592000" cy="2592000"/>
                   <wp:docPr id="5" name="Picture 5"/>
                   <wp:cNvGraphicFramePr>
                     <a:graphicFrameLocks noChangeAspect="1"/>
@@ -1543,7 +1543,7 @@
                         <pic:spPr>
                           <a:xfrm>
                             <a:off x="0" y="0"/>
-                            <a:ext cx="2592000" cy="2470603"/>
+                            <a:ext cx="2592000" cy="2592000"/>
                           </a:xfrm>
                           <a:prstGeom prst="rect"/>
                         </pic:spPr>
@@ -1572,7 +1572,7 @@
             <w:r>
               <w:drawing>
                 <wp:inline xmlns:a="http://schemas.openxmlformats.org/drawingml/2006/main" xmlns:pic="http://schemas.openxmlformats.org/drawingml/2006/picture">
-                  <wp:extent cx="2592000" cy="2470603"/>
+                  <wp:extent cx="2592000" cy="2592000"/>
                   <wp:docPr id="6" name="Picture 6"/>
                   <wp:cNvGraphicFramePr>
                     <a:graphicFrameLocks noChangeAspect="1"/>
@@ -1593,7 +1593,7 @@
                         <pic:spPr>
                           <a:xfrm>
                             <a:off x="0" y="0"/>
-                            <a:ext cx="2592000" cy="2470603"/>
+                            <a:ext cx="2592000" cy="2592000"/>
                           </a:xfrm>
                           <a:prstGeom prst="rect"/>
                         </pic:spPr>
@@ -1690,7 +1690,7 @@
             <w:r>
               <w:drawing>
                 <wp:inline xmlns:a="http://schemas.openxmlformats.org/drawingml/2006/main" xmlns:pic="http://schemas.openxmlformats.org/drawingml/2006/picture">
-                  <wp:extent cx="2592000" cy="2470603"/>
+                  <wp:extent cx="2592000" cy="2592000"/>
                   <wp:docPr id="7" name="Picture 7"/>
                   <wp:cNvGraphicFramePr>
                     <a:graphicFrameLocks noChangeAspect="1"/>
@@ -1711,7 +1711,7 @@
                         <pic:spPr>
                           <a:xfrm>
                             <a:off x="0" y="0"/>
-                            <a:ext cx="2592000" cy="2470603"/>
+                            <a:ext cx="2592000" cy="2592000"/>
                           </a:xfrm>
                           <a:prstGeom prst="rect"/>
                         </pic:spPr>
@@ -1740,7 +1740,7 @@
             <w:r>
               <w:drawing>
                 <wp:inline xmlns:a="http://schemas.openxmlformats.org/drawingml/2006/main" xmlns:pic="http://schemas.openxmlformats.org/drawingml/2006/picture">
-                  <wp:extent cx="2592000" cy="2470603"/>
+                  <wp:extent cx="2592000" cy="2592000"/>
                   <wp:docPr id="8" name="Picture 8"/>
                   <wp:cNvGraphicFramePr>
                     <a:graphicFrameLocks noChangeAspect="1"/>
@@ -1761,7 +1761,7 @@
                         <pic:spPr>
                           <a:xfrm>
                             <a:off x="0" y="0"/>
-                            <a:ext cx="2592000" cy="2470603"/>
+                            <a:ext cx="2592000" cy="2592000"/>
                           </a:xfrm>
                           <a:prstGeom prst="rect"/>
                         </pic:spPr>
@@ -1980,7 +1980,7 @@
       <w:r>
         <w:drawing>
           <wp:inline xmlns:a="http://schemas.openxmlformats.org/drawingml/2006/main" xmlns:pic="http://schemas.openxmlformats.org/drawingml/2006/picture">
-            <wp:extent cx="3240000" cy="4860000"/>
+            <wp:extent cx="3240000" cy="4861736"/>
             <wp:docPr id="9" name="Picture 9"/>
             <wp:cNvGraphicFramePr>
               <a:graphicFrameLocks noChangeAspect="1"/>
@@ -2001,7 +2001,7 @@
                   <pic:spPr>
                     <a:xfrm>
                       <a:off x="0" y="0"/>
-                      <a:ext cx="3240000" cy="4860000"/>
+                      <a:ext cx="3240000" cy="4861736"/>
                     </a:xfrm>
                     <a:prstGeom prst="rect"/>
                   </pic:spPr>
@@ -2102,7 +2102,7 @@
       <w:r>
         <w:drawing>
           <wp:inline xmlns:a="http://schemas.openxmlformats.org/drawingml/2006/main" xmlns:pic="http://schemas.openxmlformats.org/drawingml/2006/picture">
-            <wp:extent cx="3060000" cy="2916684"/>
+            <wp:extent cx="3060000" cy="3060000"/>
             <wp:docPr id="10" name="Picture 10"/>
             <wp:cNvGraphicFramePr>
               <a:graphicFrameLocks noChangeAspect="1"/>
@@ -2123,7 +2123,7 @@
                   <pic:spPr>
                     <a:xfrm>
                       <a:off x="0" y="0"/>
-                      <a:ext cx="3060000" cy="2916684"/>
+                      <a:ext cx="3060000" cy="3060000"/>
                     </a:xfrm>
                     <a:prstGeom prst="rect"/>
                   </pic:spPr>
@@ -2675,7 +2675,7 @@
       <w:r>
         <w:drawing>
           <wp:inline xmlns:a="http://schemas.openxmlformats.org/drawingml/2006/main" xmlns:pic="http://schemas.openxmlformats.org/drawingml/2006/picture">
-            <wp:extent cx="3060000" cy="2916684"/>
+            <wp:extent cx="3060000" cy="3060000"/>
             <wp:docPr id="11" name="Picture 11"/>
             <wp:cNvGraphicFramePr>
               <a:graphicFrameLocks noChangeAspect="1"/>
@@ -2696,7 +2696,7 @@
                   <pic:spPr>
                     <a:xfrm>
                       <a:off x="0" y="0"/>
-                      <a:ext cx="3060000" cy="2916684"/>
+                      <a:ext cx="3060000" cy="3060000"/>
                     </a:xfrm>
                     <a:prstGeom prst="rect"/>
                   </pic:spPr>
@@ -3180,7 +3180,7 @@
       <w:r>
         <w:drawing>
           <wp:inline xmlns:a="http://schemas.openxmlformats.org/drawingml/2006/main" xmlns:pic="http://schemas.openxmlformats.org/drawingml/2006/picture">
-            <wp:extent cx="3060000" cy="2916684"/>
+            <wp:extent cx="3060000" cy="3060000"/>
             <wp:docPr id="12" name="Picture 12"/>
             <wp:cNvGraphicFramePr>
               <a:graphicFrameLocks noChangeAspect="1"/>
@@ -3201,7 +3201,7 @@
                   <pic:spPr>
                     <a:xfrm>
                       <a:off x="0" y="0"/>
-                      <a:ext cx="3060000" cy="2916684"/>
+                      <a:ext cx="3060000" cy="3060000"/>
                     </a:xfrm>
                     <a:prstGeom prst="rect"/>
                   </pic:spPr>
@@ -3716,7 +3716,7 @@
       <w:r>
         <w:drawing>
           <wp:inline xmlns:a="http://schemas.openxmlformats.org/drawingml/2006/main" xmlns:pic="http://schemas.openxmlformats.org/drawingml/2006/picture">
-            <wp:extent cx="3060000" cy="2916684"/>
+            <wp:extent cx="3060000" cy="3060000"/>
             <wp:docPr id="13" name="Picture 13"/>
             <wp:cNvGraphicFramePr>
               <a:graphicFrameLocks noChangeAspect="1"/>
@@ -3737,7 +3737,7 @@
                   <pic:spPr>
                     <a:xfrm>
                       <a:off x="0" y="0"/>
-                      <a:ext cx="3060000" cy="2916684"/>
+                      <a:ext cx="3060000" cy="3060000"/>
                     </a:xfrm>
                     <a:prstGeom prst="rect"/>
                   </pic:spPr>
@@ -4983,7 +4983,7 @@
             <w:r>
               <w:drawing>
                 <wp:inline xmlns:a="http://schemas.openxmlformats.org/drawingml/2006/main" xmlns:pic="http://schemas.openxmlformats.org/drawingml/2006/picture">
-                  <wp:extent cx="2592000" cy="2470603"/>
+                  <wp:extent cx="2592000" cy="2592000"/>
                   <wp:docPr id="14" name="Picture 14"/>
                   <wp:cNvGraphicFramePr>
                     <a:graphicFrameLocks noChangeAspect="1"/>
@@ -5004,7 +5004,7 @@
                         <pic:spPr>
                           <a:xfrm>
                             <a:off x="0" y="0"/>
-                            <a:ext cx="2592000" cy="2470603"/>
+                            <a:ext cx="2592000" cy="2592000"/>
                           </a:xfrm>
                           <a:prstGeom prst="rect"/>
                         </pic:spPr>
@@ -5033,7 +5033,7 @@
             <w:r>
               <w:drawing>
                 <wp:inline xmlns:a="http://schemas.openxmlformats.org/drawingml/2006/main" xmlns:pic="http://schemas.openxmlformats.org/drawingml/2006/picture">
-                  <wp:extent cx="2592000" cy="2470603"/>
+                  <wp:extent cx="2592000" cy="2592000"/>
                   <wp:docPr id="15" name="Picture 15"/>
                   <wp:cNvGraphicFramePr>
                     <a:graphicFrameLocks noChangeAspect="1"/>
@@ -5054,7 +5054,7 @@
                         <pic:spPr>
                           <a:xfrm>
                             <a:off x="0" y="0"/>
-                            <a:ext cx="2592000" cy="2470603"/>
+                            <a:ext cx="2592000" cy="2592000"/>
                           </a:xfrm>
                           <a:prstGeom prst="rect"/>
                         </pic:spPr>

</xml_diff>